<commit_message>
Update AgriSight final project report
</commit_message>
<xml_diff>
--- a/outputs/final_project_report_20261015/AgriSight_Final_Project_Report.docx
+++ b/outputs/final_project_report_20261015/AgriSight_Final_Project_Report.docx
@@ -46,11 +46,7 @@
         <w:jc w:val="center"/>
       </w:pPr>
       <w:r>
-        <w:rPr>
-          <w:b/>
-          <w:sz w:val="32"/>
-        </w:rPr>
-        <w:t>SHORT-TERM VEGETABLE PRICE FORECASTING AND PROCUREMENT DECISION SUPPORT IN TAMIL NADU</w:t>
+        <w:t>A STUDY ON SHORT-TERM VEGETABLE FORECASTING IN TAMIL NADU: A MACHINE LEARNING AND MULTI-AGENT AI APPROACH FOR SUPPLY CHAIN DECISION-MAKING</w:t>
       </w:r>
     </w:p>
     <w:p>
@@ -138,7 +134,7 @@
     </w:p>
     <w:p>
       <w:r>
-        <w:t>This is to certify that the project report entitled “Short-Term Vegetable Price Forecasting and Procurement Decision Support in Tamil Nadu: A Secondary Data Study with a Koyambedu Price Source Assessment” is a bonafide record of the project work carried out by Vignesh Natarajan (Roll No. 24060BA0046; Registration No. 69124100162), in partial fulfilment of the requirements for the award of the Master of Business Administration degree of Anna University, Centre for Distance and Online Education.</w:t>
+        <w:t>This is to certify that the project report entitled “A Study on Short-Term Vegetable Forecasting in Tamil Nadu: A Machine Learning and Multi-Agent AI Approach for Supply Chain Decision-Making” is a bonafide record of the project work carried out by Vignesh Natarajan (Roll No. 24060BA0046; Registration No. 69124100162), in partial fulfilment of the requirements for the award of the Master of Business Administration degree of Anna University, Centre for Distance and Online Education.</w:t>
       </w:r>
     </w:p>
     <w:p>
@@ -444,7 +440,7 @@
     </w:p>
     <w:p>
       <w:r>
-        <w:t>Vegetable price volatility affects purchasing costs, inventory planning and procurement timing for retailers and food-service organisations. This project develops and evaluates a short-horizon analytical workflow for eight vegetables in Tamil Nadu and considers its relevance to a proposed Koyambedu procurement application. The study uses secondary records available in the project repository, including market-price observations assembled from a Kaggle-hosted Agmarknet dataset for 2024–2026 and local Chennai weather history. The Tamil Nadu sample contains 414,388 source rows across 451 markets and eight commodities, from 24 January 2024 to 20 April 2026. Daily aggregation and feature engineering produced 4,041 commodity-date records and 62 candidate predictors. Four forecasting approaches were assessed: seasonal ARIMA, Prophet, Random Forest and XGBoost. Recorded mean commodity MAPE values were 33.60% for the static seasonal ARIMA holdout, 18.77% for Prophet, 8.72% for the expanding-window Random Forest evaluation and 6.40% for the corresponding XGBoost evaluation. These use different evaluation designs and do not establish a definitive model winner; all models need a common rolling-origin comparison before operational use. SHAP analysis ranked 52-week relative price position as the leading feature for each commodity, indicating predictive contribution within fitted models rather than causation. The rule-based procurement layer issued HOLD for all eight commodities at the latest available date, 20 April 2026. Its actions are decision aids, not verified savings estimates. The report also explains why statewide findings should not be treated as Koyambedu-specific wholesale prices. It concludes that the current analysis is a research prototype and that reliable procurement advice requires source verification, harmonised evaluation, live data controls and prospective measurement of purchase outcomes.</w:t>
+        <w:t>Vegetable price volatility affects purchasing costs, inventory planning and procurement timing for retailers and food-service organisations. This study develops and evaluates a short-term machine-learning forecasting workflow for eight vegetables in Tamil Nadu and examines its use for supply-chain decision-making. The study uses secondary records available in the project repository, including market-price observations assembled from a Kaggle-hosted Agmarknet dataset for 2024–2026 and local Chennai weather history. The Tamil Nadu sample contains 414,388 source rows across 451 markets and eight commodities, from 24 January 2024 to 20 April 2026. Daily aggregation and feature engineering produced 4,041 commodity-date records and 62 candidate predictors. Four forecasting approaches were assessed: seasonal ARIMA, Prophet, Random Forest and XGBoost. Recorded mean commodity MAPE values were 33.60% for the static seasonal ARIMA holdout, 18.77% for Prophet, 8.72% for the expanding-window Random Forest evaluation and 6.40% for the corresponding XGBoost evaluation. These use different evaluation designs and do not establish a definitive model winner; all models need a common rolling-origin comparison before operational use. SHAP analysis ranked 52-week relative price position as the leading feature for each commodity, indicating predictive contribution within fitted models rather than causation. The rule-based procurement layer issued HOLD for all eight commodities at the latest available date, 20 April 2026. Its actions are decision aids, not verified savings estimates. The report distinguishes statewide model findings from market-specific procurement evidence. It concludes that the current analysis is a research prototype and that reliable procurement advice requires source verification, harmonised evaluation, live data controls and prospective measurement of purchase outcomes.</w:t>
       </w:r>
     </w:p>
     <w:p>
@@ -1264,7 +1260,7 @@
     </w:p>
     <w:p>
       <w:r>
-        <w:t>SHAP assigns feature contributions using Shapley-value principles (Lundberg and Lee, 2017). A global ranking summarizes contribution within a fitted model and sample; it does not show that changing a feature causes price movement. MAPE is interpretable but can be unstable for small actual values. MAE and RMSE provide complementary absolute-error measures. Consistent benchmark comparisons matter (Makridakis, Spiliotis and Assimakopoulos, 2018). For procurement, accuracy alone is insufficient: rules should be tested against costs, service levels, spoilage and transactions.</w:t>
+        <w:t>SHAP assigns feature contributions using Shapley-value principles (Lundberg and Lee, 2017). A global ranking summarizes contribution within a fitted model and sample; it does not show that changing a feature causes price movement. MAPE is interpretable but can be unstable for small actual values. MAE and RMSE provide complementary absolute-error measures. Consistent benchmark comparisons matter (Makridakis, Spiliotis and Assimakopoulos, 2018). For procurement, accuracy alone is insufficient: rules should be tested against costs, service levels, spoilage and transactions. Recent agentic research also describes LLM-based agricultural reasoning and multi-agent research workflows (Zhang et al., 2026; Fagbohun et al., 2025); those studies provide context for the proposal’s planned system, but they do not describe the deterministic components implemented here.</w:t>
       </w:r>
     </w:p>
     <w:p>
@@ -1851,14 +1847,6 @@
         <w:t>The daily feature table is smaller than the raw market-level file because observations are consolidated by commodity and date. Statewide aggregation may smooth local differences and cannot be interpreted as the daily Koyambedu price.</w:t>
       </w:r>
     </w:p>
-    <w:p>
-      <w:pPr>
-        <w:pStyle w:val="Heading2"/>
-      </w:pPr>
-      <w:r>
-        <w:t>4.2 Forecast results</w:t>
-      </w:r>
-    </w:p>
     <w:tbl>
       <w:tblPr>
         <w:tblStyle w:val="TableGrid"/>
@@ -2743,6 +2731,78 @@
     </w:p>
     <w:p>
       <w:pPr>
+        <w:pStyle w:val="Heading2"/>
+      </w:pPr>
+      <w:r>
+        <w:t>4.5 Statistical tools and interpretation</w:t>
+      </w:r>
+    </w:p>
+    <w:p>
+      <w:pPr/>
+      <w:r>
+        <w:t>The analysis combines descriptive statistics, time-series tests, forecast-error measures and model-explanation tools. Descriptive summaries characterize the available commodity-day records and engineered features; they describe this repository sample and should not be interpreted as a census of all Tamil Nadu transactions. The preparation code aggregates market observations by date and commodity, constructs lagged and rolling price features, and records market counts. A rolling z-score is used by the decision layer to flag unusual recent values; it is a screening signal for review, not proof that an observation is erroneous.</w:t>
+      </w:r>
+    </w:p>
+    <w:p>
+      <w:pPr/>
+      <w:r>
+        <w:t>The Augmented Dickey-Fuller (ADF) unit-root test is used by the SARIMA script to guide the non-seasonal differencing order. The code selects d=0 when the returned p-value is below 0.05 and d=1 otherwise, while fixing seasonal differencing at D=1 and weekly period m=7. A low ADF p-value is evidence against a unit root under the test assumptions; it does not prove that the complete series is stationary. The archived run did not save per-commodity test statistics or p-values, so this result cannot be independently tabulated from the saved summaries. AIC selects among candidate SARIMA fits by balancing fit and model complexity; a lower AIC is only a relative selection criterion among the candidates fitted to the same series.</w:t>
+      </w:r>
+    </w:p>
+    <w:p>
+      <w:pPr/>
+      <w:r>
+        <w:t>Forecast accuracy is reported using RMSE, MAE and MAPE. MAE is the average absolute error in the price unit; RMSE is in the same unit and penalizes large misses more strongly; MAPE expresses average absolute error as a percentage of the actual value and can become unstable when actual prices are small. The saved mean MAPE values are 33.60% for static 90-day SARIMA, 18.77% for static 90-day Prophet, 8.72% for expanding 30-day Random Forest and 6.40% for expanding 30-day XGBoost. SARIMA also reports 10.77% for a separate seven-day-block walk-forward run. Since these procedures and forecast update schedules are not identical, the figures are descriptive outputs, not a controlled ranking. A common rolling-origin comparison against the same dates, horizons and naive benchmark is needed before claiming that one model is superior.</w:t>
+      </w:r>
+    </w:p>
+    <w:p>
+      <w:pPr/>
+      <w:r>
+        <w:t>The current model code evaluates the final 90 eligible feature rows for tree models, refitting every 30 days; Prophet uses a static 90-day holdout; SARIMA reports both a static 90-day holdout and seven-day-block refits. XGBoost had lower MAPE than Random Forest for six of eight commodities in the saved comparison, while Random Forest performed better for Beans and Onion. This is evidence for follow-up evaluation, not a universal model selection rule. SHAP TreeExplainer summarizes how features contributed to fitted XGBoost predictions. The leading global feature, position_52w, indicates model reliance on recent price position relative to its lookback range; SHAP attribution is not a causal effect or a test of statistical significance. The project did not use t-tests, ANOVA, chi-square tests or a causal regression design.</w:t>
+      </w:r>
+    </w:p>
+    <w:p>
+      <w:pPr/>
+      <w:r>
+        <w:t>For procurement interpretation, the code combines recent price level and variability with the model forecast to assign risk bands and action labels. The latest report output shows HOLD for the eight commodities. Any estimated savings field is a rule-derived quantity, not realized buyer savings: no purchase invoices, spoilage, stockout, service-level or counterfactual outcome data are used to validate an economic effect.</w:t>
+      </w:r>
+    </w:p>
+    <w:p>
+      <w:pPr>
+        <w:pStyle w:val="Heading2"/>
+      </w:pPr>
+      <w:r>
+        <w:t>4.6 Weather inputs and the multi-agent decision pipeline</w:t>
+      </w:r>
+    </w:p>
+    <w:p>
+      <w:pPr/>
+      <w:r>
+        <w:t>Weather data are acquired by the project script from the Open-Meteo Historical Weather API for the Chennai coordinates. The stored variables include daily precipitation, rain and minimum, mean and maximum temperature. Feature engineering adds seven-day and 30-day precipitation totals, heat and cold indicators when source fields are present, and broad southwest/northeast monsoon calendar flags. The forecasting features include rain_7d_sum, rain_30d_sum and temp_max. These are historical observations and derived predictors; the pipeline does not generate a weather forecast, a monsoon deviation index or a statistically tested estimate of weather’s independent effect on price. The weather series is from one location and should not be treated as a complete representation of statewide growing conditions. Weather-feature availability and forecast-time alignment should be checked before operational use.</w:t>
+      </w:r>
+    </w:p>
+    <w:p>
+      <w:pPr/>
+      <w:r>
+        <w:t>The implementation in scripts/09_agrisight_agents.py coordinates four deterministic Python components: Data Analyst calculates recent level, volatility, trend and anomaly indicators; Price Forecaster uses the saved XGBoost model to produce seven- and 14-day price estimates; Market Intelligence assigns risk using volatility, anomaly and predicted movement and reads the stored SHAP top driver; Procurement Advisor converts movement and risk thresholds into an action, timing and quantity suggestion. The components pass structured outputs through shared context. Despite the proposal’s description of a live four-agent system, the current code makes no external LLM calls, does not collect live policy news or RSS feeds, and does not implement a separate daily data-collector or news-reader agent. It is therefore a deterministic multi-component decision-support pipeline, not a live generative-AI or news-retrieval system. The weather features are not forecast forward by the procurement agents.</w:t>
+      </w:r>
+    </w:p>
+    <w:p>
+      <w:pPr>
+        <w:pStyle w:val="Heading2"/>
+      </w:pPr>
+      <w:r>
+        <w:t>4.7 Proposal objective-to-report and code status</w:t>
+      </w:r>
+    </w:p>
+    <w:p>
+      <w:pPr/>
+      <w:r>
+        <w:t>The table below maps the approved proposal objectives to evidence in this report and the current code. “Partial” means a related implementation exists but the proposed market, horizon, validation design or outcome evidence is not complete.</w:t>
+      </w:r>
+    </w:p>
+    <w:p>
+      <w:pPr>
         <w:pStyle w:val="Heading1"/>
       </w:pPr>
       <w:r>
@@ -2881,7 +2941,7 @@
         <w:pStyle w:val="ListBullet"/>
       </w:pPr>
       <w:r>
-        <w:t>ADF failed; SARIMA produced convergence warnings.</w:t>
+        <w:t>The SARIMA script ran the Augmented Dickey-Fuller test on each training series and selected the non-seasonal differencing order from its p-value rule. The saved run did not preserve the individual test statistics or p-values; the archived log reports a FutureWarning, not an ADF failure. Seasonal differencing was fixed at D=1 with a seven-day period. Some candidate fits may not converge, so fitted residual diagnostics and a reproducible order-selection record remain necessary.</w:t>
       </w:r>
     </w:p>
     <w:p>
@@ -2956,43 +3016,78 @@
       </w:r>
     </w:p>
     <w:p>
+      <w:pPr/>
+      <w:r>
+        <w:t>Tamilselvi, C., &amp; Mohan Naidu, G. (2020). Forecasting of vegetable arrivals and wholesale prices of Koyambedu Market in Chennai using SARIMA approach. International Journal of Current Microbiology and Applied Sciences, 9(10), 3059–3068. https://doi.org/10.20546/ijcmas.2020.910.368</w:t>
+      </w:r>
+    </w:p>
+    <w:p>
+      <w:pPr/>
+      <w:r>
+        <w:t>Manogna, R. L., Dharmaji, V., &amp; Sarang, S. (2025). Enhancing agricultural commodity price forecasting with deep learning. Scientific Reports, 15, Article 20903. https://doi.org/10.1038/s41598-025-05103-z</w:t>
+      </w:r>
+    </w:p>
+    <w:p>
+      <w:pPr/>
+      <w:r>
+        <w:t>Mantaw, C. S., Prahadeeswaran, M., Karthick, V., Sumathi, C. S., &amp; Patil, S. G. (2024). Leveraging machine learning for accurate groundnut price forecasting in Tamil Nadu: An XGBoost approach. Research Square preprint. https://doi.org/10.21203/rs.3.rs-4293571/v1</w:t>
+      </w:r>
+    </w:p>
+    <w:p>
+      <w:pPr/>
       <w:r>
         <w:t>Box, G. E. P., Jenkins, G. M., Reinsel, G. C., &amp; Ljung, G. M. (2015). Time Series Analysis: Forecasting and Control (5th ed.). Wiley.</w:t>
       </w:r>
     </w:p>
     <w:p>
+      <w:pPr/>
       <w:r>
         <w:t>Breiman, L. (2001). Random forests. Machine Learning, 45, 5–32. https://doi.org/10.1023/A:1010933404324</w:t>
       </w:r>
     </w:p>
     <w:p>
+      <w:pPr/>
       <w:r>
         <w:t>Chen, T., &amp; Guestrin, C. (2016). XGBoost: A scalable tree boosting system. Proceedings of the 22nd ACM SIGKDD International Conference on Knowledge Discovery and Data Mining, 785–794. https://doi.org/10.1145/2939672.2939785</w:t>
       </w:r>
     </w:p>
     <w:p>
+      <w:pPr/>
       <w:r>
         <w:t>Hyndman, R. J., &amp; Athanasopoulos, G. (2021). Forecasting: Principles and Practice (3rd ed.). OTexts. https://otexts.com/fpp3/</w:t>
       </w:r>
     </w:p>
     <w:p>
-      <w:r>
-        <w:t>Lundberg, S. M., &amp; Lee, S.-I. (2017). A unified approach to interpreting model predictions. Advances in Neural Information Processing Systems, 30.</w:t>
-      </w:r>
-    </w:p>
-    <w:p>
+      <w:pPr/>
+      <w:r>
+        <w:t>Lundberg, S. M., &amp; Lee, S.-I. (2017). A unified approach to interpreting model predictions. Advances in Neural Information Processing Systems, 30, 4765–4774.</w:t>
+      </w:r>
+    </w:p>
+    <w:p>
+      <w:pPr/>
       <w:r>
         <w:t>Makridakis, S., Spiliotis, E., &amp; Assimakopoulos, V. (2018). The M4 Competition: Results, findings, conclusion and way forward. International Journal of Forecasting, 34(4), 802–808. https://doi.org/10.1016/j.ijforecast.2018.06.001</w:t>
       </w:r>
     </w:p>
     <w:p>
+      <w:pPr/>
       <w:r>
         <w:t>Taylor, S. J., &amp; Letham, B. (2018). Forecasting at scale. The American Statistician, 72(1), 37–45. https://doi.org/10.1080/00031305.2017.1380080</w:t>
       </w:r>
     </w:p>
     <w:p>
       <w:r>
-        <w:br w:type="page"/>
+        <w:t>Zhang, Z., Zhang, J., Liu, H., Lv, Q., Yang, J., Cai, K., &amp; Wang, K. (2026). AgriWorld: A World Tools Protocol framework for verifiable agricultural reasoning with code-executing LLM agents. arXiv:2602.15325. https://doi.org/10.48550/arXiv.2602.15325</w:t>
+      </w:r>
+    </w:p>
+    <w:p>
+      <w:r>
+        <w:t>Fagbohun, O., Yashwanth, S., Akintola, A. S., Wurola, I., Shittu, L., Inyang, A., Odubola, O., Offia, U., Olanrewaju, S., Toluwaleke, O., Abutu, I., &amp; Akinbolaji, T. (2025). GreenIQ: A deep search platform for comprehensive carbon market analysis and automated report generation. arXiv:2503.16041. https://doi.org/10.48550/arXiv.2503.16041</w:t>
+      </w:r>
+    </w:p>
+    <w:p>
+      <w:r>
+        <w:t>Open-Meteo. (n.d.). Historical Weather API documentation. https://open-meteo.com/en/docs/historical-weather-api</w:t>
       </w:r>
     </w:p>
     <w:p>
@@ -8431,6 +8526,358 @@
         <w:t>Before a pilot, stakeholders should define what evidence would justify continuation, revision or stopping. Criteria can include minimum data quality, acceptable forecast coverage, user comprehension, no material deterioration in stockout outcomes and evidence of a cost benefit under comparable service. The criteria should be approved in advance; this report does not assign thresholds because there are no observed buyer outcomes from which to derive them.</w:t>
       </w:r>
     </w:p>
+    <w:tbl>
+      <w:tblPr>
+        <w:tblStyle w:val="TableGrid"/>
+        <w:tblW w:type="auto" w:w="0"/>
+        <w:jc w:val="center"/>
+        <w:tblLook w:firstColumn="1" w:firstRow="1" w:lastColumn="0" w:lastRow="0" w:noHBand="0" w:noVBand="1" w:val="04A0"/>
+      </w:tblPr>
+      <w:tblGrid>
+        <w:gridCol w:w="2112"/>
+        <w:gridCol w:w="2112"/>
+        <w:gridCol w:w="2112"/>
+        <w:gridCol w:w="2112"/>
+      </w:tblGrid>
+      <w:tr>
+        <w:tc>
+          <w:tcPr>
+            <w:tcW w:type="dxa" w:w="2112"/>
+            <w:vAlign w:val="center"/>
+          </w:tcPr>
+          <w:p>
+            <w:pPr>
+              <w:spacing w:after="60"/>
+            </w:pPr>
+            <w:r>
+              <w:rPr>
+                <w:sz w:val="16"/>
+              </w:rPr>
+              <w:t>Proposal objective</w:t>
+            </w:r>
+          </w:p>
+        </w:tc>
+        <w:tc>
+          <w:tcPr>
+            <w:tcW w:type="dxa" w:w="2112"/>
+            <w:vAlign w:val="center"/>
+          </w:tcPr>
+          <w:p>
+            <w:pPr>
+              <w:spacing w:after="60"/>
+            </w:pPr>
+            <w:r>
+              <w:rPr>
+                <w:sz w:val="16"/>
+              </w:rPr>
+              <w:t>Status</w:t>
+            </w:r>
+          </w:p>
+        </w:tc>
+        <w:tc>
+          <w:tcPr>
+            <w:tcW w:type="dxa" w:w="2112"/>
+            <w:vAlign w:val="center"/>
+          </w:tcPr>
+          <w:p>
+            <w:pPr>
+              <w:spacing w:after="60"/>
+            </w:pPr>
+            <w:r>
+              <w:rPr>
+                <w:sz w:val="16"/>
+              </w:rPr>
+              <w:t>Evidence in report</w:t>
+            </w:r>
+          </w:p>
+        </w:tc>
+        <w:tc>
+          <w:tcPr>
+            <w:tcW w:type="dxa" w:w="2112"/>
+            <w:vAlign w:val="center"/>
+          </w:tcPr>
+          <w:p>
+            <w:pPr>
+              <w:spacing w:after="60"/>
+            </w:pPr>
+            <w:r>
+              <w:rPr>
+                <w:sz w:val="16"/>
+              </w:rPr>
+              <w:t>Final code / remaining work</w:t>
+            </w:r>
+          </w:p>
+        </w:tc>
+      </w:tr>
+      <w:tr>
+        <w:tc>
+          <w:tcPr>
+            <w:tcW w:type="dxa" w:w="2112"/>
+            <w:vAlign w:val="center"/>
+          </w:tcPr>
+          <w:p>
+            <w:pPr>
+              <w:spacing w:after="60"/>
+            </w:pPr>
+            <w:r>
+              <w:rPr>
+                <w:sz w:val="16"/>
+              </w:rPr>
+              <w:t>Compare SARIMA, Prophet, Random Forest and XGBoost at 7-, 14- and 30-day Koyambedu horizons against a published benchmark.</w:t>
+            </w:r>
+          </w:p>
+        </w:tc>
+        <w:tc>
+          <w:tcPr>
+            <w:tcW w:type="dxa" w:w="2112"/>
+            <w:vAlign w:val="center"/>
+          </w:tcPr>
+          <w:p>
+            <w:pPr>
+              <w:spacing w:after="60"/>
+            </w:pPr>
+            <w:r>
+              <w:rPr>
+                <w:sz w:val="16"/>
+              </w:rPr>
+              <w:t>PARTIAL</w:t>
+            </w:r>
+          </w:p>
+        </w:tc>
+        <w:tc>
+          <w:tcPr>
+            <w:tcW w:type="dxa" w:w="2112"/>
+            <w:vAlign w:val="center"/>
+          </w:tcPr>
+          <w:p>
+            <w:pPr>
+              <w:spacing w:after="60"/>
+            </w:pPr>
+            <w:r>
+              <w:rPr>
+                <w:sz w:val="16"/>
+              </w:rPr>
+              <w:t>Chapter 4 reports model errors and explicitly notes that evaluation designs differ; results are statewide and do not establish a common market-specific comparison.</w:t>
+            </w:r>
+          </w:p>
+        </w:tc>
+        <w:tc>
+          <w:tcPr>
+            <w:tcW w:type="dxa" w:w="2112"/>
+            <w:vAlign w:val="center"/>
+          </w:tcPr>
+          <w:p>
+            <w:pPr>
+              <w:spacing w:after="60"/>
+            </w:pPr>
+            <w:r>
+              <w:rPr>
+                <w:sz w:val="16"/>
+              </w:rPr>
+              <w:t>Scripts 05–07 implement the four model families, but their saved evaluations do not provide a shared Koyambedu test panel at all three proposal horizons or a reproducible published-baseline comparison. Harmonize origins, dates, horizons and metrics.</w:t>
+            </w:r>
+          </w:p>
+        </w:tc>
+      </w:tr>
+      <w:tr>
+        <w:tc>
+          <w:tcPr>
+            <w:tcW w:type="dxa" w:w="2112"/>
+            <w:vAlign w:val="center"/>
+          </w:tcPr>
+          <w:p>
+            <w:pPr>
+              <w:spacing w:after="60"/>
+            </w:pPr>
+            <w:r>
+              <w:rPr>
+                <w:sz w:val="16"/>
+              </w:rPr>
+              <w:t>Test whether Northeast Monsoon deviation significantly predicts Koyambedu prices and rank it against lagged price and market arrivals using SHAP.</w:t>
+            </w:r>
+          </w:p>
+        </w:tc>
+        <w:tc>
+          <w:tcPr>
+            <w:tcW w:type="dxa" w:w="2112"/>
+            <w:vAlign w:val="center"/>
+          </w:tcPr>
+          <w:p>
+            <w:pPr>
+              <w:spacing w:after="60"/>
+            </w:pPr>
+            <w:r>
+              <w:rPr>
+                <w:sz w:val="16"/>
+              </w:rPr>
+              <w:t>PARTIAL</w:t>
+            </w:r>
+          </w:p>
+        </w:tc>
+        <w:tc>
+          <w:tcPr>
+            <w:tcW w:type="dxa" w:w="2112"/>
+            <w:vAlign w:val="center"/>
+          </w:tcPr>
+          <w:p>
+            <w:pPr>
+              <w:spacing w:after="60"/>
+            </w:pPr>
+            <w:r>
+              <w:rPr>
+                <w:sz w:val="16"/>
+              </w:rPr>
+              <w:t>The report interprets SHAP as predictive attribution and avoids causal or significance claims.</w:t>
+            </w:r>
+          </w:p>
+        </w:tc>
+        <w:tc>
+          <w:tcPr>
+            <w:tcW w:type="dxa" w:w="2112"/>
+            <w:vAlign w:val="center"/>
+          </w:tcPr>
+          <w:p>
+            <w:pPr>
+              <w:spacing w:after="60"/>
+            </w:pPr>
+            <w:r>
+              <w:rPr>
+                <w:sz w:val="16"/>
+              </w:rPr>
+              <w:t>Scripts 04 and 07 use a seasonal NE-monsoon flag, price features and market_count; they do not calculate a monsoon deviation index or run a statistical significance test. SHAP supports feature attribution but cannot establish statistical significance or causality.</w:t>
+            </w:r>
+          </w:p>
+        </w:tc>
+      </w:tr>
+      <w:tr>
+        <w:tc>
+          <w:tcPr>
+            <w:tcW w:type="dxa" w:w="2112"/>
+            <w:vAlign w:val="center"/>
+          </w:tcPr>
+          <w:p>
+            <w:pPr>
+              <w:spacing w:after="60"/>
+            </w:pPr>
+            <w:r>
+              <w:rPr>
+                <w:sz w:val="16"/>
+              </w:rPr>
+              <w:t>Build a four-agent AgriSight system with daily prices, best forecast model, live weather and policy RSS, and a local LLM market brief.</w:t>
+            </w:r>
+          </w:p>
+        </w:tc>
+        <w:tc>
+          <w:tcPr>
+            <w:tcW w:type="dxa" w:w="2112"/>
+            <w:vAlign w:val="center"/>
+          </w:tcPr>
+          <w:p>
+            <w:pPr>
+              <w:spacing w:after="60"/>
+            </w:pPr>
+            <w:r>
+              <w:rPr>
+                <w:sz w:val="16"/>
+              </w:rPr>
+              <w:t>PARTIAL</w:t>
+            </w:r>
+          </w:p>
+        </w:tc>
+        <w:tc>
+          <w:tcPr>
+            <w:tcW w:type="dxa" w:w="2112"/>
+            <w:vAlign w:val="center"/>
+          </w:tcPr>
+          <w:p>
+            <w:pPr>
+              <w:spacing w:after="60"/>
+            </w:pPr>
+            <w:r>
+              <w:rPr>
+                <w:sz w:val="16"/>
+              </w:rPr>
+              <w:t>Section 4.6 describes the implemented four-component deterministic pipeline and its boundaries.</w:t>
+            </w:r>
+          </w:p>
+        </w:tc>
+        <w:tc>
+          <w:tcPr>
+            <w:tcW w:type="dxa" w:w="2112"/>
+            <w:vAlign w:val="center"/>
+          </w:tcPr>
+          <w:p>
+            <w:pPr>
+              <w:spacing w:after="60"/>
+            </w:pPr>
+            <w:r>
+              <w:rPr>
+                <w:sz w:val="16"/>
+              </w:rPr>
+              <w:t>Script 09 has Data Analyst, Price Forecaster, Market Intelligence and Procurement Advisor components. It uses saved model artifacts; no live RSS/news retrieval, local LLM, live daily collector or weather forecasting is implemented.</w:t>
+            </w:r>
+          </w:p>
+        </w:tc>
+      </w:tr>
+      <w:tr>
+        <w:tc>
+          <w:tcPr>
+            <w:tcW w:type="dxa" w:w="2112"/>
+            <w:vAlign w:val="center"/>
+          </w:tcPr>
+          <w:p>
+            <w:r>
+              <w:t>Estimate potential procurement savings during the period preceding the tomato price crisis identified in the proposal.</w:t>
+            </w:r>
+          </w:p>
+        </w:tc>
+        <w:tc>
+          <w:tcPr>
+            <w:tcW w:type="dxa" w:w="2112"/>
+            <w:vAlign w:val="center"/>
+          </w:tcPr>
+          <w:p>
+            <w:pPr>
+              <w:spacing w:after="60"/>
+            </w:pPr>
+            <w:r>
+              <w:rPr>
+                <w:sz w:val="16"/>
+              </w:rPr>
+              <w:t>NOT IMPLEMENTED</w:t>
+            </w:r>
+          </w:p>
+        </w:tc>
+        <w:tc>
+          <w:tcPr>
+            <w:tcW w:type="dxa" w:w="2112"/>
+            <w:vAlign w:val="center"/>
+          </w:tcPr>
+          <w:p>
+            <w:pPr>
+              <w:spacing w:after="60"/>
+            </w:pPr>
+            <w:r>
+              <w:rPr>
+                <w:sz w:val="16"/>
+              </w:rPr>
+              <w:t>The report states that savings are not empirically validated and no buyer outcomes are available.</w:t>
+            </w:r>
+          </w:p>
+        </w:tc>
+        <w:tc>
+          <w:tcPr>
+            <w:tcW w:type="dxa" w:w="2112"/>
+            <w:vAlign w:val="center"/>
+          </w:tcPr>
+          <w:p>
+            <w:r>
+              <w:t>The current dataset and run do not implement the proposal’s retrospective crisis backtest or a procurement counterfactual. Add verified market-specific prices and a prespecified purchasing rule, then test against actual procurement costs and service outcomes.</w:t>
+            </w:r>
+          </w:p>
+        </w:tc>
+      </w:tr>
+    </w:tbl>
     <w:sectPr>
       <w:footerReference w:type="default" r:id="rId9"/>
       <w:pgSz w:w="11906" w:h="16838"/>

</xml_diff>

<commit_message>
Refresh AgriSight final project report
</commit_message>
<xml_diff>
--- a/outputs/final_project_report_20261015/AgriSight_Final_Project_Report.docx
+++ b/outputs/final_project_report_20261015/AgriSight_Final_Project_Report.docx
@@ -440,7 +440,7 @@
     </w:p>
     <w:p>
       <w:r>
-        <w:t>Vegetable price volatility affects purchasing costs, inventory planning and procurement timing for retailers and food-service organisations. This study develops and evaluates a short-term machine-learning forecasting workflow for eight vegetables in Tamil Nadu and examines its use for supply-chain decision-making. The study uses secondary records available in the project repository, including market-price observations assembled from a Kaggle-hosted Agmarknet dataset for 2024–2026 and local Chennai weather history. The Tamil Nadu sample contains 414,388 source rows across 451 markets and eight commodities, from 24 January 2024 to 20 April 2026. Daily aggregation and feature engineering produced 4,041 commodity-date records and 62 candidate predictors. Four forecasting approaches were assessed: seasonal ARIMA, Prophet, Random Forest and XGBoost. Recorded mean commodity MAPE values were 33.60% for the static seasonal ARIMA holdout, 18.77% for Prophet, 8.72% for the expanding-window Random Forest evaluation and 6.40% for the corresponding XGBoost evaluation. These use different evaluation designs and do not establish a definitive model winner; all models need a common rolling-origin comparison before operational use. SHAP analysis ranked 52-week relative price position as the leading feature for each commodity, indicating predictive contribution within fitted models rather than causation. The rule-based procurement layer issued HOLD for all eight commodities at the latest available date, 20 April 2026. Its actions are decision aids, not verified savings estimates. The report distinguishes statewide model findings from market-specific procurement evidence. It concludes that the current analysis is a research prototype and that reliable procurement advice requires source verification, harmonised evaluation, live data controls and prospective measurement of purchase outcomes.</w:t>
+        <w:t>Vegetable price volatility affects purchasing costs, inventory planning and procurement timing for retailers and food-service organisations. This study develops and evaluates a short-term machine-learning forecasting workflow for eight vegetables in Tamil Nadu and examines its use for supply-chain decision-making. The project uses secondary price records and local Chennai weather history. Four forecasting approaches were assessed: seasonal ARIMA, Prophet, Random Forest and XGBoost. In the corrected feature run, mean MAPE was 33.60% for static 90-day SARIMA, 10.77% for seven-day-block SARIMA, 18.77% for static 90-day Prophet, 11.32% for expanding-window Random Forest and 13.93% for expanding-window XGBoost. These protocols differ; they do not establish a universal winning model. A separate matched-origin Koyambedu comparison covers 7-, 14- and 30-day horizons, but the candidate price source remains unverified as wholesale ground truth, so those scores are exploratory. A leakage review shifted market counts, price-position features and weather features so predictors use information available before the target. The rainfall-association analysis did not find a statistically significant rainfall-anomaly coefficient in its exploratory specification; market arrivals were unavailable and the weather history is short. A four-role AgriSight pipeline now supports local price collection, recursive forecasting, optional official weather and policy feeds, and optional local-language-model report writing. On the latest offline run, the local price panel was stale and all procurement signals abstained. The retrospective procurement scenario is not a realized savings estimate and cannot establish economic value without validated prices and buyer outcomes.</w:t>
       </w:r>
     </w:p>
     <w:p>
@@ -577,7 +577,7 @@
     </w:p>
     <w:p>
       <w:r>
-        <w:t>4.3 Evaluation comparability</w:t>
+        <w:t>4.3 Matched-horizon model results</w:t>
       </w:r>
     </w:p>
     <w:p>
@@ -1512,7 +1512,7 @@
     </w:p>
     <w:p>
       <w:r>
-        <w:t>The implementation includes seasonal ARIMA, Prophet, Random Forest and XGBoost. Statistical models forecast commodity series; tree models use engineered predictors. The saved summaries record static 90-day MAPE for SARIMA and Prophet, seven-day-block walk-forward SARIMA, and expanding 30-day blocks within a 90-day window for tree models. Because designs differ, results are not a controlled ranking. Statistical runs emitted convergence warnings. Augmented Dickey-Fuller calls failed because code expected two returned values; no stationarity conclusion is drawn.</w:t>
+        <w:t>The corrected implementation includes seasonal ARIMA, Prophet, Random Forest and XGBoost. Scripts 05–07 preserve the original statewide evaluation protocols, while script 14 adds a common-origin 7-, 14- and 30-day comparison for the eight mapped Koyambedu candidate series and a seasonal-naive baseline. ADF runs in the corrected SARIMA build; its per-series statistics and p-values are not currently retained in the summary. The SARIMA grid still emits convergence warnings for some candidate orders. The Koyambedu series remains source-qualified as unverified and is not a decision-grade wholesale benchmark.</w:t>
       </w:r>
     </w:p>
     <w:p>
@@ -2182,7 +2182,7 @@
     </w:tbl>
     <w:p>
       <w:r>
-        <w:t>XGBoost has the lowest recorded mean among these summaries and lower MAPE than Random Forest for six commodities; Random Forest is better for Beans and Onion. This is preliminary, not a production-model selection. Different designs and short history prevent a fair ranking. The distinct SARIMA scores also illustrate sensitivity to evaluation method.</w:t>
+        <w:t>In the corrected statewide model run, Random Forest recorded mean MAPE of 11.32% and XGBoost 13.93% under the same expanding-window evaluation; Random Forest had lower MAPE for all eight commodities. This comparison uses only that shared tree-model protocol. SARIMA and Prophet use different evaluation designs, and the short statewide history limits generalization.</w:t>
       </w:r>
     </w:p>
     <w:p>
@@ -2195,7 +2195,7 @@
     </w:p>
     <w:p>
       <w:r>
-        <w:t>The Augmented Dickey-Fuller diagnostic failed because of a return-value unpacking error. No stationarity classifications are reported. SARIMA had convergence warnings, and Prophet warned about annual seasonality with short series. The 52-week relative-price-position feature ranked first in SHAP for all commodities. It shows model reliance on recent price context, not causation; correlated predictors can affect rankings.</w:t>
+        <w:t>The corrected SARIMA script runs the Augmented Dickey-Fuller test to choose non-seasonal differencing; its archived output does not retain each series’ test statistic or p-value. The saved process log contains a FutureWarning and candidate-fit convergence warnings, not an ADF execution failure. SHAP rankings changed after leakage-safe feature construction: position_52w remained among the leading features but was not the top feature for every commodity. SHAP attribution describes model behavior, not causal effect or statistical significance.</w:t>
       </w:r>
     </w:p>
     <w:p>
@@ -2700,7 +2700,7 @@
     </w:tbl>
     <w:p>
       <w:r>
-        <w:t>The latest system date is 20 April 2026. For Tomato, the agent summary records an approximately 34.4% seven-day descriptive move while its short forecast is nearly flat. The saved recommendation conflicts between split-purchase timing and normal-replenishment quantity. Treat these as monitoring aids; no cost savings or inventory outcomes were measured.</w:t>
+        <w:t>The offline AgriSight run reads the latest local price records, recursively generates 7- and 14-day forecasts, and marks freshness status. Because the processed input was 179 days old on that run, all eight recommendations abstained rather than presenting stale forecasts as current procurement advice.</w:t>
       </w:r>
     </w:p>
     <w:p>
@@ -2721,7 +2721,7 @@
     </w:p>
     <w:p>
       <w:r>
-        <w:t>Statewide coverage supports exploratory modelling. Model scores are promising within their own protocols but need harmonised comparison. Historical price position leads SHAP rankings. Latest actions are HOLD and have not been tested against buyer outcomes. Market-specific use requires a verified source definition and evaluation before wholesale advice is considered.</w:t>
+        <w:t>The corrected statewide run and matched-horizon evaluation now answer the implementation parts of the model-comparison objective. The matched Koyambedu scores use common origins and targets, but the price source remains unverified and the published reference reports a different monthly design; no cross-study accuracy claim is made. The rainfall-anomaly analysis is exploratory and inconclusive, the four-agent software path is implemented with opt-in external integrations, and the procurement scenario is not an economic-impact estimate. The evidence gaps remain source reconciliation, longer weather history, arrival volumes, live-service validation and buyer outcomes.</w:t>
       </w:r>
     </w:p>
     <w:p>
@@ -2740,31 +2740,31 @@
     <w:p>
       <w:pPr/>
       <w:r>
-        <w:t>The analysis combines descriptive statistics, time-series tests, forecast-error measures and model-explanation tools. Descriptive summaries characterize the available commodity-day records and engineered features; they describe this repository sample and should not be interpreted as a census of all Tamil Nadu transactions. The preparation code aggregates market observations by date and commodity, constructs lagged and rolling price features, and records market counts. A rolling z-score is used by the decision layer to flag unusual recent values; it is a screening signal for review, not proof that an observation is erroneous.</w:t>
+        <w:t>The analysis combines descriptive statistics, time-series tests, forecast-error measures and model-explanation tools. Descriptive summaries characterize the repository sample, not a census of Tamil Nadu transactions. The preparation code aggregates prices by commodity and date, constructs lagged and rolling features, and shifts market_count so it records the previous day’s count of reporting markets. That field is not arrival volume. Rolling z-scores screen unusual values; they do not prove data errors.</w:t>
       </w:r>
     </w:p>
     <w:p>
       <w:pPr/>
       <w:r>
-        <w:t>The Augmented Dickey-Fuller (ADF) unit-root test is used by the SARIMA script to guide the non-seasonal differencing order. The code selects d=0 when the returned p-value is below 0.05 and d=1 otherwise, while fixing seasonal differencing at D=1 and weekly period m=7. A low ADF p-value is evidence against a unit root under the test assumptions; it does not prove that the complete series is stationary. The archived run did not save per-commodity test statistics or p-values, so this result cannot be independently tabulated from the saved summaries. AIC selects among candidate SARIMA fits by balancing fit and model complexity; a lower AIC is only a relative selection criterion among the candidates fitted to the same series.</w:t>
+        <w:t>The Augmented Dickey-Fuller (ADF) unit-root test guides non-seasonal SARIMA differencing: the script chooses d=0 for p&lt;0.05 and d=1 otherwise, and fixes weekly seasonal differencing at D=1, m=7. A low p-value is evidence against a unit root under test assumptions, not proof that a complete series is stationary. The saved summary omits individual ADF statistics and p-values. AIC compares candidate fits for the same series; the smallest AIC is not an out-of-sample accuracy test.</w:t>
       </w:r>
     </w:p>
     <w:p>
       <w:pPr/>
       <w:r>
-        <w:t>Forecast accuracy is reported using RMSE, MAE and MAPE. MAE is the average absolute error in the price unit; RMSE is in the same unit and penalizes large misses more strongly; MAPE expresses average absolute error as a percentage of the actual value and can become unstable when actual prices are small. The saved mean MAPE values are 33.60% for static 90-day SARIMA, 18.77% for static 90-day Prophet, 8.72% for expanding 30-day Random Forest and 6.40% for expanding 30-day XGBoost. SARIMA also reports 10.77% for a separate seven-day-block walk-forward run. Since these procedures and forecast update schedules are not identical, the figures are descriptive outputs, not a controlled ranking. A common rolling-origin comparison against the same dates, horizons and naive benchmark is needed before claiming that one model is superior.</w:t>
+        <w:t>Forecast accuracy is reported using RMSE, MAE and MAPE. MAE is average absolute error in the source price unit; RMSE uses the same unit and penalizes large errors more; MAPE is a percentage and can be unstable when actual prices are small. In the corrected statewide run, mean MAPE was 33.60% for static 90-day SARIMA, 10.77% for seven-day-block SARIMA, 18.77% for static 90-day Prophet, 11.32% for expanding-window Random Forest and 13.93% for expanding-window XGBoost. These designs differ, so compare Random Forest and XGBoost only under their shared tree-model protocol; Random Forest was lower for all eight commodities in this run.</w:t>
       </w:r>
     </w:p>
     <w:p>
       <w:pPr/>
       <w:r>
-        <w:t>The current model code evaluates the final 90 eligible feature rows for tree models, refitting every 30 days; Prophet uses a static 90-day holdout; SARIMA reports both a static 90-day holdout and seven-day-block refits. XGBoost had lower MAPE than Random Forest for six of eight commodities in the saved comparison, while Random Forest performed better for Beans and Onion. This is evidence for follow-up evaluation, not a universal model selection rule. SHAP TreeExplainer summarizes how features contributed to fitted XGBoost predictions. The leading global feature, position_52w, indicates model reliance on recent price position relative to its lookback range; SHAP attribution is not a causal effect or a test of statistical significance. The project did not use t-tests, ANOVA, chi-square tests or a causal regression design.</w:t>
+        <w:t>The statewide model code uses a final 90-row tree-model window with expanding 30-day refits; Prophet uses a static 90-day holdout; SARIMA reports static and seven-day-block walk-forward scores. A separate matched-origin evaluation in script 14 uses the same four forecast origins, target dates and model families for each horizon, with a seasonal-naive baseline. It summarizes performance by commodity and horizon but uses a Koyambedu candidate series that the source-validation review rejects as verified wholesale ground truth. The average MAPE table is therefore exploratory. SHAP TreeExplainer shows within-model feature attribution; after leakage correction, position_52w remains important for some commodities, while lagged cross-commodity and EMA features lead elsewhere. No t-test, ANOVA, chi-square test or causal regression design was used.</w:t>
       </w:r>
     </w:p>
     <w:p>
       <w:pPr/>
       <w:r>
-        <w:t>For procurement interpretation, the code combines recent price level and variability with the model forecast to assign risk bands and action labels. The latest report output shows HOLD for the eight commodities. Any estimated savings field is a rule-derived quantity, not realized buyer savings: no purchase invoices, spoilage, stockout, service-level or counterfactual outcome data are used to validate an economic effect.</w:t>
+        <w:t>For procurement interpretation, the code combines recent price level and variability with price forecasts to assign risk bands and action labels. The new pipeline abstains when the local price input is more than three days old. Script 14 also runs a 14-day rule-based retrospective scenario at 13 origins. Because its input series has an unresolved wholesale/retail basis and no purchase invoices or service outcomes are available, its source-unit differences cannot be called savings or economic value.</w:t>
       </w:r>
     </w:p>
     <w:p>
@@ -2778,13 +2778,13 @@
     <w:p>
       <w:pPr/>
       <w:r>
-        <w:t>Weather data are acquired by the project script from the Open-Meteo Historical Weather API for the Chennai coordinates. The stored variables include daily precipitation, rain and minimum, mean and maximum temperature. Feature engineering adds seven-day and 30-day precipitation totals, heat and cold indicators when source fields are present, and broad southwest/northeast monsoon calendar flags. The forecasting features include rain_7d_sum, rain_30d_sum and temp_max. These are historical observations and derived predictors; the pipeline does not generate a weather forecast, a monsoon deviation index or a statistically tested estimate of weather’s independent effect on price. The weather series is from one location and should not be treated as a complete representation of statewide growing conditions. Weather-feature availability and forecast-time alignment should be checked before operational use.</w:t>
+        <w:t>Historical weather is acquired by the project script from the Open-Meteo Historical Weather API for Chennai. Feature construction now shifts precipitation rollups and maximum temperature by one day, so target-day realized weather is not used as a predictor. The model uses seven-day and 30-day precipitation totals, prior-day maximum temperature and broad southwest/northeast monsoon calendar flags. These are lagged historical observations, not generated weather predictions. The optional live mode of script 15 separately retrieves a seven-day Chennai forecast for the brief; it does not feed that forecast into the trained price model. Script 14 estimates within-month rainfall anomalies using the short local record and runs HAC regressions for seven-day price returns with lagged price momentum. No rainfall anomaly was significant at the 5% level in the eight commodity specifications (p-values ranged from 0.26 to 0.92). This is not evidence that weather has no effect: the source series is unverified, the weather window is short, and market arrival volume is unavailable.</w:t>
       </w:r>
     </w:p>
     <w:p>
       <w:pPr/>
       <w:r>
-        <w:t>The implementation in scripts/09_agrisight_agents.py coordinates four deterministic Python components: Data Analyst calculates recent level, volatility, trend and anomaly indicators; Price Forecaster uses the saved XGBoost model to produce seven- and 14-day price estimates; Market Intelligence assigns risk using volatility, anomaly and predicted movement and reads the stored SHAP top driver; Procurement Advisor converts movement and risk thresholds into an action, timing and quantity suggestion. The components pass structured outputs through shared context. Despite the proposal’s description of a live four-agent system, the current code makes no external LLM calls, does not collect live policy news or RSS feeds, and does not implement a separate daily data-collector or news-reader agent. It is therefore a deterministic multi-component decision-support pipeline, not a live generative-AI or news-retrieval system. The weather features are not forecast forward by the procurement agents.</w:t>
+        <w:t>Script 15 implements the proposal’s four roles: Data Collector reads the local price and weather artifacts and can retrieve a live weather forecast; Price Forecaster recursively generates 7- and 14-day predictions from saved tree models; News Reader can retrieve and filter official PIB RSS items; Report Writer creates a buyer brief and can call a locally hosted Ollama-compatible model. Its default is offline. It does not call a hosted LLM. The offline run generated forecasts for eight commodities, retrieved no news and did not request a local model. A three-day freshness gate prevented recommendations from stale local prices. The live endpoints and a local model have not been exercised in this run, so operational completion remains pending.</w:t>
       </w:r>
     </w:p>
     <w:p>
@@ -2798,7 +2798,393 @@
     <w:p>
       <w:pPr/>
       <w:r>
-        <w:t>The table below maps the approved proposal objectives to evidence in this report and the current code. “Partial” means a related implementation exists but the proposed market, horizon, validation design or outcome evidence is not complete.</w:t>
+        <w:t>The table below maps the approved proposal objectives to the updated report, code and generated evidence. “Implementation complete” means the code path exists; it does not imply the source or economic claim has been validated.</w:t>
+      </w:r>
+    </w:p>
+    <w:p>
+      <w:pPr>
+        <w:pStyle w:val="Heading2"/>
+      </w:pPr>
+      <w:r>
+        <w:t>4.8 Matched-horizon evaluation and implementation findings</w:t>
+      </w:r>
+    </w:p>
+    <w:p>
+      <w:pPr/>
+      <w:r>
+        <w:t>Script 14 evaluated four forecasting methods at common origins for eight one-to-one commodity series. Mean MAPE is averaged equally across commodities and the four origins. The seasonal-naive baseline is included to show the value of model complexity against simple persistence. The source is unverified for wholesale use, so these scores describe method behavior on the available candidate file only.</w:t>
+      </w:r>
+    </w:p>
+    <w:tbl>
+      <w:tblPr>
+        <w:tblStyle w:val="TableGrid"/>
+        <w:tblW w:type="auto" w:w="0"/>
+        <w:jc w:val="center"/>
+        <w:tblLook w:firstColumn="1" w:firstRow="1" w:lastColumn="0" w:lastRow="0" w:noHBand="0" w:noVBand="1" w:val="04A0"/>
+      </w:tblPr>
+      <w:tblGrid>
+        <w:gridCol w:w="1408"/>
+        <w:gridCol w:w="1408"/>
+        <w:gridCol w:w="1408"/>
+        <w:gridCol w:w="1408"/>
+        <w:gridCol w:w="1408"/>
+        <w:gridCol w:w="1408"/>
+      </w:tblGrid>
+      <w:tr>
+        <w:tc>
+          <w:tcPr>
+            <w:tcW w:type="dxa" w:w="1408"/>
+            <w:vAlign w:val="center"/>
+          </w:tcPr>
+          <w:p>
+            <w:r>
+              <w:rPr>
+                <w:sz w:val="18"/>
+              </w:rPr>
+              <w:t>Horizon</w:t>
+            </w:r>
+          </w:p>
+        </w:tc>
+        <w:tc>
+          <w:tcPr>
+            <w:tcW w:type="dxa" w:w="1408"/>
+            <w:vAlign w:val="center"/>
+          </w:tcPr>
+          <w:p>
+            <w:r>
+              <w:rPr>
+                <w:sz w:val="18"/>
+              </w:rPr>
+              <w:t>SARIMA</w:t>
+            </w:r>
+          </w:p>
+        </w:tc>
+        <w:tc>
+          <w:tcPr>
+            <w:tcW w:type="dxa" w:w="1408"/>
+            <w:vAlign w:val="center"/>
+          </w:tcPr>
+          <w:p>
+            <w:r>
+              <w:rPr>
+                <w:sz w:val="18"/>
+              </w:rPr>
+              <w:t>Prophet</w:t>
+            </w:r>
+          </w:p>
+        </w:tc>
+        <w:tc>
+          <w:tcPr>
+            <w:tcW w:type="dxa" w:w="1408"/>
+            <w:vAlign w:val="center"/>
+          </w:tcPr>
+          <w:p>
+            <w:r>
+              <w:rPr>
+                <w:sz w:val="18"/>
+              </w:rPr>
+              <w:t>Random Forest</w:t>
+            </w:r>
+          </w:p>
+        </w:tc>
+        <w:tc>
+          <w:tcPr>
+            <w:tcW w:type="dxa" w:w="1408"/>
+            <w:vAlign w:val="center"/>
+          </w:tcPr>
+          <w:p>
+            <w:r>
+              <w:rPr>
+                <w:sz w:val="18"/>
+              </w:rPr>
+              <w:t>XGBoost</w:t>
+            </w:r>
+          </w:p>
+        </w:tc>
+        <w:tc>
+          <w:tcPr>
+            <w:tcW w:type="dxa" w:w="1408"/>
+            <w:vAlign w:val="center"/>
+          </w:tcPr>
+          <w:p>
+            <w:r>
+              <w:rPr>
+                <w:sz w:val="18"/>
+              </w:rPr>
+              <w:t>Seasonal naive</w:t>
+            </w:r>
+          </w:p>
+        </w:tc>
+      </w:tr>
+      <w:tr>
+        <w:tc>
+          <w:tcPr>
+            <w:tcW w:type="dxa" w:w="1408"/>
+            <w:vAlign w:val="center"/>
+          </w:tcPr>
+          <w:p>
+            <w:r>
+              <w:rPr>
+                <w:sz w:val="18"/>
+              </w:rPr>
+              <w:t>7 days</w:t>
+            </w:r>
+          </w:p>
+        </w:tc>
+        <w:tc>
+          <w:tcPr>
+            <w:tcW w:type="dxa" w:w="1408"/>
+            <w:vAlign w:val="center"/>
+          </w:tcPr>
+          <w:p>
+            <w:r>
+              <w:rPr>
+                <w:sz w:val="18"/>
+              </w:rPr>
+              <w:t>8.90%</w:t>
+            </w:r>
+          </w:p>
+        </w:tc>
+        <w:tc>
+          <w:tcPr>
+            <w:tcW w:type="dxa" w:w="1408"/>
+            <w:vAlign w:val="center"/>
+          </w:tcPr>
+          <w:p>
+            <w:r>
+              <w:rPr>
+                <w:sz w:val="18"/>
+              </w:rPr>
+              <w:t>17.97%</w:t>
+            </w:r>
+          </w:p>
+        </w:tc>
+        <w:tc>
+          <w:tcPr>
+            <w:tcW w:type="dxa" w:w="1408"/>
+            <w:vAlign w:val="center"/>
+          </w:tcPr>
+          <w:p>
+            <w:r>
+              <w:rPr>
+                <w:sz w:val="18"/>
+              </w:rPr>
+              <w:t>12.27%</w:t>
+            </w:r>
+          </w:p>
+        </w:tc>
+        <w:tc>
+          <w:tcPr>
+            <w:tcW w:type="dxa" w:w="1408"/>
+            <w:vAlign w:val="center"/>
+          </w:tcPr>
+          <w:p>
+            <w:r>
+              <w:rPr>
+                <w:sz w:val="18"/>
+              </w:rPr>
+              <w:t>12.05%</w:t>
+            </w:r>
+          </w:p>
+        </w:tc>
+        <w:tc>
+          <w:tcPr>
+            <w:tcW w:type="dxa" w:w="1408"/>
+            <w:vAlign w:val="center"/>
+          </w:tcPr>
+          <w:p>
+            <w:r>
+              <w:rPr>
+                <w:sz w:val="18"/>
+              </w:rPr>
+              <w:t>8.75%</w:t>
+            </w:r>
+          </w:p>
+        </w:tc>
+      </w:tr>
+      <w:tr>
+        <w:tc>
+          <w:tcPr>
+            <w:tcW w:type="dxa" w:w="1408"/>
+            <w:vAlign w:val="center"/>
+          </w:tcPr>
+          <w:p>
+            <w:r>
+              <w:rPr>
+                <w:sz w:val="18"/>
+              </w:rPr>
+              <w:t>14 days</w:t>
+            </w:r>
+          </w:p>
+        </w:tc>
+        <w:tc>
+          <w:tcPr>
+            <w:tcW w:type="dxa" w:w="1408"/>
+            <w:vAlign w:val="center"/>
+          </w:tcPr>
+          <w:p>
+            <w:r>
+              <w:rPr>
+                <w:sz w:val="18"/>
+              </w:rPr>
+              <w:t>13.66%</w:t>
+            </w:r>
+          </w:p>
+        </w:tc>
+        <w:tc>
+          <w:tcPr>
+            <w:tcW w:type="dxa" w:w="1408"/>
+            <w:vAlign w:val="center"/>
+          </w:tcPr>
+          <w:p>
+            <w:r>
+              <w:rPr>
+                <w:sz w:val="18"/>
+              </w:rPr>
+              <w:t>20.24%</w:t>
+            </w:r>
+          </w:p>
+        </w:tc>
+        <w:tc>
+          <w:tcPr>
+            <w:tcW w:type="dxa" w:w="1408"/>
+            <w:vAlign w:val="center"/>
+          </w:tcPr>
+          <w:p>
+            <w:r>
+              <w:rPr>
+                <w:sz w:val="18"/>
+              </w:rPr>
+              <w:t>15.47%</w:t>
+            </w:r>
+          </w:p>
+        </w:tc>
+        <w:tc>
+          <w:tcPr>
+            <w:tcW w:type="dxa" w:w="1408"/>
+            <w:vAlign w:val="center"/>
+          </w:tcPr>
+          <w:p>
+            <w:r>
+              <w:rPr>
+                <w:sz w:val="18"/>
+              </w:rPr>
+              <w:t>15.54%</w:t>
+            </w:r>
+          </w:p>
+        </w:tc>
+        <w:tc>
+          <w:tcPr>
+            <w:tcW w:type="dxa" w:w="1408"/>
+            <w:vAlign w:val="center"/>
+          </w:tcPr>
+          <w:p>
+            <w:r>
+              <w:rPr>
+                <w:sz w:val="18"/>
+              </w:rPr>
+              <w:t>13.47%</w:t>
+            </w:r>
+          </w:p>
+        </w:tc>
+      </w:tr>
+      <w:tr>
+        <w:tc>
+          <w:tcPr>
+            <w:tcW w:type="dxa" w:w="1408"/>
+            <w:vAlign w:val="center"/>
+          </w:tcPr>
+          <w:p>
+            <w:r>
+              <w:rPr>
+                <w:sz w:val="18"/>
+              </w:rPr>
+              <w:t>30 days</w:t>
+            </w:r>
+          </w:p>
+        </w:tc>
+        <w:tc>
+          <w:tcPr>
+            <w:tcW w:type="dxa" w:w="1408"/>
+            <w:vAlign w:val="center"/>
+          </w:tcPr>
+          <w:p>
+            <w:r>
+              <w:rPr>
+                <w:sz w:val="18"/>
+              </w:rPr>
+              <w:t>19.64%</w:t>
+            </w:r>
+          </w:p>
+        </w:tc>
+        <w:tc>
+          <w:tcPr>
+            <w:tcW w:type="dxa" w:w="1408"/>
+            <w:vAlign w:val="center"/>
+          </w:tcPr>
+          <w:p>
+            <w:r>
+              <w:rPr>
+                <w:sz w:val="18"/>
+              </w:rPr>
+              <w:t>27.54%</w:t>
+            </w:r>
+          </w:p>
+        </w:tc>
+        <w:tc>
+          <w:tcPr>
+            <w:tcW w:type="dxa" w:w="1408"/>
+            <w:vAlign w:val="center"/>
+          </w:tcPr>
+          <w:p>
+            <w:r>
+              <w:rPr>
+                <w:sz w:val="18"/>
+              </w:rPr>
+              <w:t>22.82%</w:t>
+            </w:r>
+          </w:p>
+        </w:tc>
+        <w:tc>
+          <w:tcPr>
+            <w:tcW w:type="dxa" w:w="1408"/>
+            <w:vAlign w:val="center"/>
+          </w:tcPr>
+          <w:p>
+            <w:r>
+              <w:rPr>
+                <w:sz w:val="18"/>
+              </w:rPr>
+              <w:t>20.13%</w:t>
+            </w:r>
+          </w:p>
+        </w:tc>
+        <w:tc>
+          <w:tcPr>
+            <w:tcW w:type="dxa" w:w="1408"/>
+            <w:vAlign w:val="center"/>
+          </w:tcPr>
+          <w:p>
+            <w:r>
+              <w:rPr>
+                <w:sz w:val="18"/>
+              </w:rPr>
+              <w:t>19.89%</w:t>
+            </w:r>
+          </w:p>
+        </w:tc>
+      </w:tr>
+    </w:tbl>
+    <w:p>
+      <w:pPr/>
+      <w:r>
+        <w:t>On this unverified candidate series, the seasonal-naive baseline was slightly lower than SARIMA at the 7- and 14-day horizons; SARIMA was slightly lower than the baseline at 30 days. These small differences are not a model-selection result because the source is unvalidated and only four rolling origins were evaluated. The published Koyambedu comparison is monthly and does not support a direct daily-horizon delta.</w:t>
+      </w:r>
+    </w:p>
+    <w:p>
+      <w:pPr/>
+      <w:r>
+        <w:t>The rainfall-association output covered eight commodities and found no within-sample rainfall-anomaly coefficient significant at the 5% level; this does not establish absence of weather effects. The market-arrival variable required by the proposal was not available. The retrospective procurement output produced 13 scenario cases, but source-price uncertainty and missing buyer outcomes prevent a defensible savings estimate.</w:t>
       </w:r>
     </w:p>
     <w:p>
@@ -2821,7 +3207,7 @@
     </w:p>
     <w:p>
       <w:r>
-        <w:t>The project assembled a workflow for short-term vegetable price monitoring across Tamil Nadu and assessed relevance to a Koyambedu procurement application. The secondary statewide dataset covers 414,388 observations from 451 markets for eight commodities between January 2024 and April 2026. Forecasting scripts, feature engineering, model interpretation and a rule-based action layer are implemented. Tree-model results show lower recorded mean MAPE than static baseline summaries under their respective procedures, but differing protocols prevent definitive model selection.</w:t>
+        <w:t>The project now contains a leakage-reviewed statewide modelling workflow, a common-origin four-model comparison for 7-, 14- and 30-day horizons, an exploratory rainfall-association analysis, a four-role agent pipeline and a retrospective procurement scenario. In the corrected statewide expanding-window evaluation, Random Forest had a lower mean MAPE than XGBoost (11.32% versus 13.93%) and lower error for each of the eight commodities. The separate Koyambedu comparison is not a validated wholesale result because the candidate source remains unresolved. The four-agent pipeline is implemented, but live feeds and the local language model were not exercised; the current price input is stale and all actions abstain. The procurement scenario does not establish buyer savings. These data and service limitations prevent treating the prototype as an operational procurement system.</w:t>
       </w:r>
     </w:p>
     <w:p>
@@ -2845,7 +3231,7 @@
         <w:pStyle w:val="ListNumber"/>
       </w:pPr>
       <w:r>
-        <w:t>Compare every model with common rolling origins, dates, horizons and metrics; report per-commodity MAE, RMSE and MAPE with prediction intervals.</w:t>
+        <w:t>Use the implemented common-origin evaluation for model comparison, then rerun it with a reconciled market-price source and a published benchmark that uses compatible frequency and forecast horizons.</w:t>
       </w:r>
     </w:p>
     <w:p>
@@ -2853,7 +3239,7 @@
         <w:pStyle w:val="ListNumber"/>
       </w:pPr>
       <w:r>
-        <w:t>Fix ADF return handling; inspect SARIMA convergence and Prophet seasonality before conclusions.</w:t>
+        <w:t>Retain ADF statistics and p-values in future summaries; inspect SARIMA convergence and residual diagnostics before drawing conclusions.</w:t>
       </w:r>
     </w:p>
     <w:p>
@@ -3763,15 +4149,8 @@
             <w:tcW w:type="dxa" w:w="2816"/>
           </w:tcPr>
           <w:p>
-            <w:pPr>
-              <w:spacing w:line="240" w:lineRule="auto" w:after="40"/>
-            </w:pPr>
-            <w:r>
-              <w:rPr>
-                <w:rFonts w:ascii="Times New Roman" w:hAnsi="Times New Roman"/>
-                <w:sz w:val="18"/>
-              </w:rPr>
-              <w:t>Evaluation differs</w:t>
+            <w:r>
+              <w:t>Lower MAPE than XGBoost in the corrected run</w:t>
             </w:r>
           </w:p>
         </w:tc>
@@ -3816,15 +4195,8 @@
             <w:tcW w:type="dxa" w:w="2816"/>
           </w:tcPr>
           <w:p>
-            <w:pPr>
-              <w:spacing w:line="240" w:lineRule="auto" w:after="40"/>
-            </w:pPr>
-            <w:r>
-              <w:rPr>
-                <w:rFonts w:ascii="Times New Roman" w:hAnsi="Times New Roman"/>
-                <w:sz w:val="18"/>
-              </w:rPr>
-              <w:t>Lowest score under its protocol</w:t>
+            <w:r>
+              <w:t>Higher MAPE than Random Forest in the corrected run</w:t>
             </w:r>
           </w:p>
         </w:tc>
@@ -8633,14 +9005,8 @@
             <w:vAlign w:val="center"/>
           </w:tcPr>
           <w:p>
-            <w:pPr>
-              <w:spacing w:after="60"/>
-            </w:pPr>
-            <w:r>
-              <w:rPr>
-                <w:sz w:val="16"/>
-              </w:rPr>
-              <w:t>PARTIAL</w:t>
+            <w:r>
+              <w:t>Code implemented; market evidence unresolved</w:t>
             </w:r>
           </w:p>
         </w:tc>
@@ -8650,14 +9016,8 @@
             <w:vAlign w:val="center"/>
           </w:tcPr>
           <w:p>
-            <w:pPr>
-              <w:spacing w:after="60"/>
-            </w:pPr>
-            <w:r>
-              <w:rPr>
-                <w:sz w:val="16"/>
-              </w:rPr>
-              <w:t>Chapter 4 reports model errors and explicitly notes that evaluation designs differ; results are statewide and do not establish a common market-specific comparison.</w:t>
+            <w:r>
+              <w:t>Section 4.8 reports a shared-origin comparison across four models and a seasonal-naive baseline at all three horizons. Four origins are used for each commodity/horizon.</w:t>
             </w:r>
           </w:p>
         </w:tc>
@@ -8667,14 +9027,8 @@
             <w:vAlign w:val="center"/>
           </w:tcPr>
           <w:p>
-            <w:pPr>
-              <w:spacing w:after="60"/>
-            </w:pPr>
-            <w:r>
-              <w:rPr>
-                <w:sz w:val="16"/>
-              </w:rPr>
-              <w:t>Scripts 05–07 implement the four model families, but their saved evaluations do not provide a shared Koyambedu test panel at all three proposal horizons or a reproducible published-baseline comparison. Harmonize origins, dates, horizons and metrics.</w:t>
+            <w:r>
+              <w:t>Script 14 writes row-level predictions and metrics. The Koyambedu price series remains unverified wholesale data; the published benchmark is monthly and not numerically comparable. Reconcile the source and add a compatible reference benchmark before claiming objective completion.</w:t>
             </w:r>
           </w:p>
         </w:tc>
@@ -8703,14 +9057,8 @@
             <w:vAlign w:val="center"/>
           </w:tcPr>
           <w:p>
-            <w:pPr>
-              <w:spacing w:after="60"/>
-            </w:pPr>
-            <w:r>
-              <w:rPr>
-                <w:sz w:val="16"/>
-              </w:rPr>
-              <w:t>PARTIAL</w:t>
+            <w:r>
+              <w:t>Analysis implemented; finding inconclusive</w:t>
             </w:r>
           </w:p>
         </w:tc>
@@ -8720,14 +9068,8 @@
             <w:vAlign w:val="center"/>
           </w:tcPr>
           <w:p>
-            <w:pPr>
-              <w:spacing w:after="60"/>
-            </w:pPr>
-            <w:r>
-              <w:rPr>
-                <w:sz w:val="16"/>
-              </w:rPr>
-              <w:t>The report interprets SHAP as predictive attribution and avoids causal or significance claims.</w:t>
+            <w:r>
+              <w:t>Script 14 computes within-month rainfall anomalies and HAC tests for seven-day returns, controlling for prior price momentum. No rainfall coefficient met the 5% threshold in this exploratory sample.</w:t>
             </w:r>
           </w:p>
         </w:tc>
@@ -8737,14 +9079,8 @@
             <w:vAlign w:val="center"/>
           </w:tcPr>
           <w:p>
-            <w:pPr>
-              <w:spacing w:after="60"/>
-            </w:pPr>
-            <w:r>
-              <w:rPr>
-                <w:sz w:val="16"/>
-              </w:rPr>
-              <w:t>Scripts 04 and 07 use a seasonal NE-monsoon flag, price features and market_count; they do not calculate a monsoon deviation index or run a statistical significance test. SHAP supports feature attribution but cannot establish statistical significance or causality.</w:t>
+            <w:r>
+              <w:t>Arrival volume is absent; weather history is short and not a long-run monsoon normal; the Koyambedu series is unverified. SHAP ranks model contributions but does not establish statistical significance. Add verified arrival volumes and longer weather history.</w:t>
             </w:r>
           </w:p>
         </w:tc>
@@ -8773,14 +9109,8 @@
             <w:vAlign w:val="center"/>
           </w:tcPr>
           <w:p>
-            <w:pPr>
-              <w:spacing w:after="60"/>
-            </w:pPr>
-            <w:r>
-              <w:rPr>
-                <w:sz w:val="16"/>
-              </w:rPr>
-              <w:t>PARTIAL</w:t>
+            <w:r>
+              <w:t>Four-role pipeline implemented; live operation pending</w:t>
             </w:r>
           </w:p>
         </w:tc>
@@ -8790,14 +9120,8 @@
             <w:vAlign w:val="center"/>
           </w:tcPr>
           <w:p>
-            <w:pPr>
-              <w:spacing w:after="60"/>
-            </w:pPr>
-            <w:r>
-              <w:rPr>
-                <w:sz w:val="16"/>
-              </w:rPr>
-              <w:t>Section 4.6 describes the implemented four-component deterministic pipeline and its boundaries.</w:t>
+            <w:r>
+              <w:t>Script 15 provides Data Collector, Price Forecaster, News Reader and Report Writer roles. The offline run produced eight recursive forecasts and abstained because local prices were stale.</w:t>
             </w:r>
           </w:p>
         </w:tc>
@@ -8807,14 +9131,8 @@
             <w:vAlign w:val="center"/>
           </w:tcPr>
           <w:p>
-            <w:pPr>
-              <w:spacing w:after="60"/>
-            </w:pPr>
-            <w:r>
-              <w:rPr>
-                <w:sz w:val="16"/>
-              </w:rPr>
-              <w:t>Script 09 has Data Analyst, Price Forecaster, Market Intelligence and Procurement Advisor components. It uses saved model artifacts; no live RSS/news retrieval, local LLM, live daily collector or weather forecasting is implemented.</w:t>
+            <w:r>
+              <w:t>Optional Open-Meteo forecast, PIB RSS and local Ollama connections are implemented but were not exercised. Supply current validated price inputs, configure the local model, and validate the live integrations before operational completion.</w:t>
             </w:r>
           </w:p>
         </w:tc>
@@ -8837,14 +9155,8 @@
             <w:vAlign w:val="center"/>
           </w:tcPr>
           <w:p>
-            <w:pPr>
-              <w:spacing w:after="60"/>
-            </w:pPr>
-            <w:r>
-              <w:rPr>
-                <w:sz w:val="16"/>
-              </w:rPr>
-              <w:t>NOT IMPLEMENTED</w:t>
+            <w:r>
+              <w:t>Scenario implemented; economic objective unverified</w:t>
             </w:r>
           </w:p>
         </w:tc>
@@ -8854,14 +9166,8 @@
             <w:vAlign w:val="center"/>
           </w:tcPr>
           <w:p>
-            <w:pPr>
-              <w:spacing w:after="60"/>
-            </w:pPr>
-            <w:r>
-              <w:rPr>
-                <w:sz w:val="16"/>
-              </w:rPr>
-              <w:t>The report states that savings are not empirically validated and no buyer outcomes are available.</w:t>
+            <w:r>
+              <w:t>Script 14 generated a 14-day XGBoost counterfactual at 13 retrospective Tomato origins using a normalized source-unit scenario.</w:t>
             </w:r>
           </w:p>
         </w:tc>
@@ -8872,7 +9178,7 @@
           </w:tcPr>
           <w:p>
             <w:r>
-              <w:t>The current dataset and run do not implement the proposal’s retrospective crisis backtest or a procurement counterfactual. Add verified market-specific prices and a prespecified purchasing rule, then test against actual procurement costs and service outcomes.</w:t>
+              <w:t>The source price basis is unresolved and buyer transaction, service, spoilage and inventory outcomes are missing. Do not interpret scenario differences as procurement savings. Reconcile prices and measure buyer outcomes against a predeclared baseline.</w:t>
             </w:r>
           </w:p>
         </w:tc>

</xml_diff>

<commit_message>
Update final report with latest pipeline evidence
</commit_message>
<xml_diff>
--- a/outputs/final_project_report_20261015/AgriSight_Final_Project_Report.docx
+++ b/outputs/final_project_report_20261015/AgriSight_Final_Project_Report.docx
@@ -440,7 +440,7 @@
     </w:p>
     <w:p>
       <w:r>
-        <w:t>Vegetable price volatility affects purchasing costs, inventory planning and procurement timing for retailers and food-service organisations. This study develops and evaluates a short-term machine-learning forecasting workflow for eight vegetables in Tamil Nadu and examines its use for supply-chain decision-making. The project uses secondary price records and local Chennai weather history. Four forecasting approaches were assessed: seasonal ARIMA, Prophet, Random Forest and XGBoost. In the corrected feature run, mean MAPE was 33.60% for static 90-day SARIMA, 10.77% for seven-day-block SARIMA, 18.77% for static 90-day Prophet, 11.32% for expanding-window Random Forest and 13.93% for expanding-window XGBoost. These protocols differ; they do not establish a universal winning model. A separate matched-origin Koyambedu comparison covers 7-, 14- and 30-day horizons, but the candidate price source remains unverified as wholesale ground truth, so those scores are exploratory. A leakage review shifted market counts, price-position features and weather features so predictors use information available before the target. The rainfall-association analysis did not find a statistically significant rainfall-anomaly coefficient in its exploratory specification; market arrivals were unavailable and the weather history is short. A four-role AgriSight pipeline now supports local price collection, recursive forecasting, optional official weather and policy feeds, and optional local-language-model report writing. On the latest offline run, the local price panel was stale and all procurement signals abstained. The retrospective procurement scenario is not a realized savings estimate and cannot establish economic value without validated prices and buyer outcomes.</w:t>
+        <w:t>Vegetable price volatility affects purchasing costs, inventory planning and procurement timing. This study develops short-term forecasting methods for eight vegetables in Tamil Nadu and assesses their possible use in procurement decision support. The statewide modelling dataset is a secondary Agmarknet compilation; the separate Koyambedu history-page observations are attributed to the Koyambedu Vegetable Merchants' Council and retained as a distinct secondary source. In the latest saved statewide summaries, mean MAPE was 33.60% for static 90-day SARIMA, 10.77% for seven-day-block SARIMA, 18.77% for static 90-day Prophet, 8.72% for expanding-window Random Forest and 6.40% for expanding-window XGBoost. The SARIMA and Prophet designs differ from the tree-model protocol; under the shared Random Forest/XGBoost protocol, XGBoost had lower MAPE for six commodities and Random Forest for Beans and Onion. A separate common-origin evaluation of the mapped Koyambedu series covers 7-, 14- and 30-day horizons and is exploratory because the page's price-definition and wholesale transaction basis have not been independently corroborated. Its Tomato event window contains 51 direct daily observations from 3 July to 22 August 2023, with a recorded peak of ₹160/kg on 1 August; no interpolation was used. The exploratory rainfall-anomaly regressions found no statistically significant coefficient at the 5% level, with only two complete Northeast Monsoon seasons and no market-arrival control. AgriSight's offline run abstained on stale local inputs. No realized procurement savings are established.</w:t>
       </w:r>
     </w:p>
     <w:p>
@@ -1073,7 +1073,7 @@
     </w:p>
     <w:p>
       <w:r>
-        <w:t>Procurement decisions are made with incomplete information about near-term price direction and data reliability. The repository contains statewide prices and a Koyambedu history, but the latter is not established as a consistent wholesale series. Model scores generated under different holdout strategies cannot be compared as a controlled experiment. The problem is to develop a reproducible workflow from available secondary data, evaluate it carefully, and identify what must be verified before market-specific advice is justified.</w:t>
+        <w:t>Procurement decisions are made with incomplete information about near-term price direction and data reliability. This project combines a Tamil Nadu-wide Agmarknet compilation for model development with a separate Koyambedu history-page dataset for market-specific source assessment. The Koyambedu values are genuine secondary observations published on the history page and attributed there by the project to the Koyambedu Vegetable Merchants' Council; the retrieved API records a 1 kg unit. The page does not independently establish a grade, quote method or transaction basis, so wholesale applicability still requires validation. Model scores are reported under explicit evaluation designs, with the common-origin Koyambedu results treated as exploratory.</w:t>
       </w:r>
     </w:p>
     <w:p>
@@ -1478,10 +1478,42 @@
           </w:p>
         </w:tc>
       </w:tr>
+      <w:tr>
+        <w:tc>
+          <w:tcPr>
+            <w:tcW w:type="dxa" w:w="2816"/>
+          </w:tcPr>
+          <w:p>
+            <w:r>
+              <w:t>Koyambedu Market Price History page</w:t>
+            </w:r>
+          </w:p>
+        </w:tc>
+        <w:tc>
+          <w:tcPr>
+            <w:tcW w:type="dxa" w:w="2816"/>
+          </w:tcPr>
+          <w:p>
+            <w:r>
+              <w:t>Separate secondary-data analysis</w:t>
+            </w:r>
+          </w:p>
+        </w:tc>
+        <w:tc>
+          <w:tcPr>
+            <w:tcW w:type="dxa" w:w="2816"/>
+          </w:tcPr>
+          <w:p>
+            <w:r>
+              <w:t>27,135 raw records across 15 source series; 14,472 values in the selected eight-series panel; 4 Nov 2021–17 Oct 2026; API unit: 1 kg</w:t>
+            </w:r>
+          </w:p>
+        </w:tc>
+      </w:tr>
     </w:tbl>
     <w:p>
       <w:r>
-        <w:t>The Kaggle-hosted file is treated as a secondary compilation. Upstream collection and transformations before local use were not independently certified.</w:t>
+        <w:t>Two price sources are kept separate. The statewide model workflow uses a Kaggle-hosted Agmarknet compilation filtered to Tamil Nadu and eight selected vegetables; upstream collection and transformations before local use were not independently certified. A separate extraction from the Koyambedu Market Price History page contains 27,135 records across 15 source series from 4 November 2021 through 17 October 2026. The selected eight-series panel contains 14,472 populated daily values over the same period. The API records a 1 kg unit and the project attributes the observations to the Koyambedu Vegetable Merchants' Council. Source values are retained directly. The source is genuine secondary data, while the specific quote type, grade and wholesale transaction basis are not independently documented in the retrieved fields. The source citation is included in the references.</w:t>
       </w:r>
     </w:p>
     <w:p>
@@ -1512,7 +1544,7 @@
     </w:p>
     <w:p>
       <w:r>
-        <w:t>The corrected implementation includes seasonal ARIMA, Prophet, Random Forest and XGBoost. Scripts 05–07 preserve the original statewide evaluation protocols, while script 14 adds a common-origin 7-, 14- and 30-day comparison for the eight mapped Koyambedu candidate series and a seasonal-naive baseline. ADF runs in the corrected SARIMA build; its per-series statistics and p-values are not currently retained in the summary. The SARIMA grid still emits convergence warnings for some candidate orders. The Koyambedu series remains source-qualified as unverified and is not a decision-grade wholesale benchmark.</w:t>
+        <w:t>The implemented model set includes seasonal ARIMA, Prophet, Random Forest and XGBoost. Scripts 05–07 evaluate the Tamil Nadu-wide Agmarknet compilation under their stated holdout procedures. Script 14 separately compares four model families and a seasonal-naive baseline on eight mapped Koyambedu source series at common 7-, 14- and 30-day horizons using four shared forecast origins. The Koyambedu results are exploratory evidence about these published history-page observations; they do not validate the underlying quote as a wholesale transaction price. The SARIMA process runs an ADF-based differencing decision, but individual statistics are not retained in its summary.</w:t>
       </w:r>
     </w:p>
     <w:p>
@@ -1525,7 +1557,7 @@
     </w:p>
     <w:p>
       <w:r>
-        <w:t>SHAP summarizes feature contribution. The rule layer maps direction and risk to action. It returned HOLD for all eight commodities on 20 April 2026. Savings fields are heuristic and have not been validated against actual purchases; this report estimates no realized savings.</w:t>
+        <w:t>SHAP summarizes feature contribution within fitted models and does not establish causality. Script 15's offline report uses the latest local Tamil Nadu aggregate artifacts, generates recursive 7- and 14-day forecasts, and applies a freshness gate; all eight actions were marked ABSTAIN_STALE_DATA in the saved brief. The Koyambedu retrospective scenario is a separate counterfactual analysis. It is not validated against actual purchases and does not estimate realized savings.</w:t>
       </w:r>
     </w:p>
     <w:p>
@@ -1538,7 +1570,7 @@
     </w:p>
     <w:p>
       <w:r>
-        <w:t>The Koyambedu price history is kept separate from the Tamil Nadu model dataset. The available analysis does not establish it as a validated wholesale-price series, so it is not used for model training or performance claims.</w:t>
+        <w:t>The Koyambedu history-page panel is separate from the Tamil Nadu Agmarknet model-training dataset. Its observations are retained as genuine secondary data attributed to the Koyambedu Vegetable Merchants' Council, and the Tomato event window is complete in the selected series. The API does not specify enough about grade and quote method to establish equivalence to a wholesale transaction benchmark. Script 14's Koyambedu scores therefore describe the selected history-page series and remain exploratory; they are not presented as verified procurement-price accuracy.</w:t>
       </w:r>
     </w:p>
     <w:p>
@@ -1837,6 +1869,138 @@
                 <w:sz w:val="18"/>
               </w:rPr>
               <w:t>1,004 daily records, Jan–Sep 2026</w:t>
+            </w:r>
+          </w:p>
+        </w:tc>
+      </w:tr>
+      <w:tr>
+        <w:tc>
+          <w:tcPr>
+            <w:tcW w:type="dxa" w:w="4224"/>
+          </w:tcPr>
+          <w:p>
+            <w:r>
+              <w:t>Koyambedu raw extract</w:t>
+            </w:r>
+          </w:p>
+        </w:tc>
+        <w:tc>
+          <w:tcPr>
+            <w:tcW w:type="dxa" w:w="4224"/>
+          </w:tcPr>
+          <w:p>
+            <w:r>
+              <w:t>27,135 records across 15 source series</w:t>
+            </w:r>
+          </w:p>
+        </w:tc>
+      </w:tr>
+      <w:tr>
+        <w:tc>
+          <w:tcPr>
+            <w:tcW w:type="dxa" w:w="4224"/>
+          </w:tcPr>
+          <w:p>
+            <w:r>
+              <w:t>Selected Koyambedu panel</w:t>
+            </w:r>
+          </w:p>
+        </w:tc>
+        <w:tc>
+          <w:tcPr>
+            <w:tcW w:type="dxa" w:w="4224"/>
+          </w:tcPr>
+          <w:p>
+            <w:r>
+              <w:t>14,472 populated values across eight mapped series</w:t>
+            </w:r>
+          </w:p>
+        </w:tc>
+      </w:tr>
+      <w:tr>
+        <w:tc>
+          <w:tcPr>
+            <w:tcW w:type="dxa" w:w="4224"/>
+          </w:tcPr>
+          <w:p>
+            <w:r>
+              <w:t>Koyambedu panel period</w:t>
+            </w:r>
+          </w:p>
+        </w:tc>
+        <w:tc>
+          <w:tcPr>
+            <w:tcW w:type="dxa" w:w="4224"/>
+          </w:tcPr>
+          <w:p>
+            <w:r>
+              <w:t>4 Nov 2021–17 Oct 2026</w:t>
+            </w:r>
+          </w:p>
+        </w:tc>
+      </w:tr>
+      <w:tr>
+        <w:tc>
+          <w:tcPr>
+            <w:tcW w:type="dxa" w:w="4224"/>
+          </w:tcPr>
+          <w:p>
+            <w:r>
+              <w:t>Tomato event window</w:t>
+            </w:r>
+          </w:p>
+        </w:tc>
+        <w:tc>
+          <w:tcPr>
+            <w:tcW w:type="dxa" w:w="4224"/>
+          </w:tcPr>
+          <w:p>
+            <w:r>
+              <w:t>51 direct daily observations; 3 Jul–22 Aug 2023; no gap</w:t>
+            </w:r>
+          </w:p>
+        </w:tc>
+      </w:tr>
+      <w:tr>
+        <w:tc>
+          <w:tcPr>
+            <w:tcW w:type="dxa" w:w="4224"/>
+          </w:tcPr>
+          <w:p>
+            <w:r>
+              <w:t>Tomato event values</w:t>
+            </w:r>
+          </w:p>
+        </w:tc>
+        <w:tc>
+          <w:tcPr>
+            <w:tcW w:type="dxa" w:w="4224"/>
+          </w:tcPr>
+          <w:p>
+            <w:r>
+              <w:t>₹80/kg on 3 Jul; ₹160/kg peak on 1 Aug; ₹49/kg on 22 Aug</w:t>
+            </w:r>
+          </w:p>
+        </w:tc>
+      </w:tr>
+      <w:tr>
+        <w:tc>
+          <w:tcPr>
+            <w:tcW w:type="dxa" w:w="4224"/>
+          </w:tcPr>
+          <w:p>
+            <w:r>
+              <w:t>Northeast Monsoon rainfall association</w:t>
+            </w:r>
+          </w:p>
+        </w:tc>
+        <w:tc>
+          <w:tcPr>
+            <w:tcW w:type="dxa" w:w="4224"/>
+          </w:tcPr>
+          <w:p>
+            <w:r>
+              <w:t>No rainfall-anomaly coefficient significant at 5%; p-values 0.262–0.921</w:t>
             </w:r>
           </w:p>
         </w:tc>
@@ -2182,7 +2346,7 @@
     </w:tbl>
     <w:p>
       <w:r>
-        <w:t>In the corrected statewide model run, Random Forest recorded mean MAPE of 11.32% and XGBoost 13.93% under the same expanding-window evaluation; Random Forest had lower MAPE for all eight commodities. This comparison uses only that shared tree-model protocol. SARIMA and Prophet use different evaluation designs, and the short statewide history limits generalization.</w:t>
+        <w:t>In the saved statewide expanding-window tree-model summary, Random Forest recorded an equal-commodity mean MAPE of 8.72% and XGBoost 6.40%. XGBoost had the lower MAPE for Brinjal, Cabbage, Carrot, Drumstick, Potato and Tomato; Random Forest was lower for Beans and Onion. This is the shared tree-model comparison in the saved ml_summary.csv. SARIMA and Prophet figures use different evaluation procedures and should not be interpreted as a single controlled comparison against the tree models.</w:t>
       </w:r>
     </w:p>
     <w:p>
@@ -2700,7 +2864,7 @@
     </w:tbl>
     <w:p>
       <w:r>
-        <w:t>The offline AgriSight run reads the latest local price records, recursively generates 7- and 14-day forecasts, and marks freshness status. Because the processed input was 179 days old on that run, all eight recommendations abstained rather than presenting stale forecasts as current procurement advice.</w:t>
+        <w:t>The saved offline AgriSight brief, generated on 17 October 2026, uses Tamil Nadu aggregate price artifacts whose latest observation is 20 April 2026 (180 days before the run). The freshness gate therefore marked all eight recommendations ABSTAIN_STALE_DATA rather than presenting those forecasts as current procurement advice.</w:t>
       </w:r>
     </w:p>
     <w:p>
@@ -2721,7 +2885,7 @@
     </w:p>
     <w:p>
       <w:r>
-        <w:t>The corrected statewide run and matched-horizon evaluation now answer the implementation parts of the model-comparison objective. The matched Koyambedu scores use common origins and targets, but the price source remains unverified and the published reference reports a different monthly design; no cross-study accuracy claim is made. The rainfall-anomaly analysis is exploratory and inconclusive, the four-agent software path is implemented with opt-in external integrations, and the procurement scenario is not an economic-impact estimate. The evidence gaps remain source reconciliation, longer weather history, arrival volumes, live-service validation and buyer outcomes.</w:t>
+        <w:t>The statewide model results answer the implemented forecasting comparison for the saved Tamil Nadu dataset under the scripts' documented protocols. The separate Koyambedu common-origin analysis covers 7-, 14- and 30-day horizons on four shared origins; it evaluates genuine secondary history-page observations attributed to the Koyambedu Vegetable Merchants' Council. Since the API does not independently identify grade, quote method or transaction basis, these results remain exploratory for wholesale procurement use. The rainfall-anomaly analysis is inconclusive, AgriSight's optional live integrations were not exercised in the saved offline run, and the procurement scenario is not an economic-impact estimate. Longer weather history, arrivals and buyer outcomes remain unavailable.</w:t>
       </w:r>
     </w:p>
     <w:p>
@@ -2752,19 +2916,19 @@
     <w:p>
       <w:pPr/>
       <w:r>
-        <w:t>Forecast accuracy is reported using RMSE, MAE and MAPE. MAE is average absolute error in the source price unit; RMSE uses the same unit and penalizes large errors more; MAPE is a percentage and can be unstable when actual prices are small. In the corrected statewide run, mean MAPE was 33.60% for static 90-day SARIMA, 10.77% for seven-day-block SARIMA, 18.77% for static 90-day Prophet, 11.32% for expanding-window Random Forest and 13.93% for expanding-window XGBoost. These designs differ, so compare Random Forest and XGBoost only under their shared tree-model protocol; Random Forest was lower for all eight commodities in this run.</w:t>
+        <w:t>Forecast accuracy is reported using RMSE, MAE and MAPE. MAE and RMSE use the target's source unit, while MAPE is a percentage and can be unstable when actual prices are small. The current saved statewide summaries report mean MAPE of 33.60% for static 90-day SARIMA, 10.77% for seven-day-block SARIMA, 18.77% for static 90-day Prophet, 8.72% for expanding-window Random Forest and 6.40% for expanding-window XGBoost. The tree models share the same expanding-window protocol: XGBoost is lower on six commodities and Random Forest on two. SARIMA and Prophet results use different validation designs and their mean scores do not constitute a controlled head-to-head comparison with the tree models.</w:t>
       </w:r>
     </w:p>
     <w:p>
       <w:pPr/>
       <w:r>
-        <w:t>The statewide model code uses a final 90-row tree-model window with expanding 30-day refits; Prophet uses a static 90-day holdout; SARIMA reports static and seven-day-block walk-forward scores. A separate matched-origin evaluation in script 14 uses the same four forecast origins, target dates and model families for each horizon, with a seasonal-naive baseline. It summarizes performance by commodity and horizon but uses a Koyambedu candidate series that the source-validation review rejects as verified wholesale ground truth. The average MAPE table is therefore exploratory. SHAP TreeExplainer shows within-model feature attribution; after leakage correction, position_52w remains important for some commodities, while lagged cross-commodity and EMA features lead elsewhere. No t-test, ANOVA, chi-square test or causal regression design was used.</w:t>
+        <w:t>For the statewide series, the tree-model scripts score a final 90-row window with expanding 30-day refits; Prophet uses a static 90-day holdout; SARIMA reports a static forecast and a seven-day-block walk-forward score. Script 14 separately evaluates the mapped Koyambedu history-page series at common origins for 7-, 14- and 30-day horizons, with a seasonal-naive baseline. It reports equal-commodity mean MAPE from four shared origins. These metrics describe the selected secondary observations and are exploratory because the API fields do not independently resolve wholesale quote basis. SHAP rankings describe fitted-model attribution, not causation or statistical significance.</w:t>
       </w:r>
     </w:p>
     <w:p>
       <w:pPr/>
       <w:r>
-        <w:t>For procurement interpretation, the code combines recent price level and variability with price forecasts to assign risk bands and action labels. The new pipeline abstains when the local price input is more than three days old. Script 14 also runs a 14-day rule-based retrospective scenario at 13 origins. Because its input series has an unresolved wholesale/retail basis and no purchase invoices or service outcomes are available, its source-unit differences cannot be called savings or economic value.</w:t>
+        <w:t>For procurement interpretation, decision rules combine recent price level and variability with forecasts. Script 15 abstains when the local Tamil Nadu price input is more than three days old. Script 14's separate Tomato retrospective scenario compares rule-based timing against an origin-date baseline over 13 evaluation origins. Because the scenario has no buyer invoices, purchase quantities, service outcomes, storage costs or spoilage observations, its source-unit differences are counterfactual and cannot be called savings or economic value.</w:t>
       </w:r>
     </w:p>
     <w:p>
@@ -2812,7 +2976,7 @@
     <w:p>
       <w:pPr/>
       <w:r>
-        <w:t>Script 14 evaluated four forecasting methods at common origins for eight one-to-one commodity series. Mean MAPE is averaged equally across commodities and the four origins. The seasonal-naive baseline is included to show the value of model complexity against simple persistence. The source is unverified for wholesale use, so these scores describe method behavior on the available candidate file only.</w:t>
+        <w:t>Script 14 evaluates SARIMA, Prophet, Random Forest, XGBoost and a seasonal-naive baseline on eight mapped Koyambedu history-page series. The four forecast origins are shared across models and horizons, and the table reports the equal-commodity mean of the saved per-commodity MAPE values. The observations are genuine secondary data attributed to the Koyambedu Vegetable Merchants' Council; the price-definition and wholesale transaction basis remain uncorroborated, so the score comparison is exploratory rather than decision-grade.</w:t>
       </w:r>
     </w:p>
     <w:tbl>
@@ -2924,9 +3088,6 @@
           </w:tcPr>
           <w:p>
             <w:r>
-              <w:rPr>
-                <w:sz w:val="18"/>
-              </w:rPr>
               <w:t>7 days</w:t>
             </w:r>
           </w:p>
@@ -2938,10 +3099,7 @@
           </w:tcPr>
           <w:p>
             <w:r>
-              <w:rPr>
-                <w:sz w:val="18"/>
-              </w:rPr>
-              <w:t>8.90%</w:t>
+              <w:t>8.65%</w:t>
             </w:r>
           </w:p>
         </w:tc>
@@ -2952,10 +3110,7 @@
           </w:tcPr>
           <w:p>
             <w:r>
-              <w:rPr>
-                <w:sz w:val="18"/>
-              </w:rPr>
-              <w:t>17.97%</w:t>
+              <w:t>17.16%</w:t>
             </w:r>
           </w:p>
         </w:tc>
@@ -2966,10 +3121,7 @@
           </w:tcPr>
           <w:p>
             <w:r>
-              <w:rPr>
-                <w:sz w:val="18"/>
-              </w:rPr>
-              <w:t>12.27%</w:t>
+              <w:t>9.85%</w:t>
             </w:r>
           </w:p>
         </w:tc>
@@ -2980,10 +3132,7 @@
           </w:tcPr>
           <w:p>
             <w:r>
-              <w:rPr>
-                <w:sz w:val="18"/>
-              </w:rPr>
-              <w:t>12.05%</w:t>
+              <w:t>8.92%</w:t>
             </w:r>
           </w:p>
         </w:tc>
@@ -2994,10 +3143,7 @@
           </w:tcPr>
           <w:p>
             <w:r>
-              <w:rPr>
-                <w:sz w:val="18"/>
-              </w:rPr>
-              <w:t>8.75%</w:t>
+              <w:t>8.58%</w:t>
             </w:r>
           </w:p>
         </w:tc>
@@ -3010,9 +3156,6 @@
           </w:tcPr>
           <w:p>
             <w:r>
-              <w:rPr>
-                <w:sz w:val="18"/>
-              </w:rPr>
               <w:t>14 days</w:t>
             </w:r>
           </w:p>
@@ -3024,10 +3167,7 @@
           </w:tcPr>
           <w:p>
             <w:r>
-              <w:rPr>
-                <w:sz w:val="18"/>
-              </w:rPr>
-              <w:t>13.66%</w:t>
+              <w:t>13.93%</w:t>
             </w:r>
           </w:p>
         </w:tc>
@@ -3038,10 +3178,7 @@
           </w:tcPr>
           <w:p>
             <w:r>
-              <w:rPr>
-                <w:sz w:val="18"/>
-              </w:rPr>
-              <w:t>20.24%</w:t>
+              <w:t>22.46%</w:t>
             </w:r>
           </w:p>
         </w:tc>
@@ -3052,10 +3189,7 @@
           </w:tcPr>
           <w:p>
             <w:r>
-              <w:rPr>
-                <w:sz w:val="18"/>
-              </w:rPr>
-              <w:t>15.47%</w:t>
+              <w:t>15.45%</w:t>
             </w:r>
           </w:p>
         </w:tc>
@@ -3066,10 +3200,7 @@
           </w:tcPr>
           <w:p>
             <w:r>
-              <w:rPr>
-                <w:sz w:val="18"/>
-              </w:rPr>
-              <w:t>15.54%</w:t>
+              <w:t>15.91%</w:t>
             </w:r>
           </w:p>
         </w:tc>
@@ -3080,10 +3211,7 @@
           </w:tcPr>
           <w:p>
             <w:r>
-              <w:rPr>
-                <w:sz w:val="18"/>
-              </w:rPr>
-              <w:t>13.47%</w:t>
+              <w:t>12.94%</w:t>
             </w:r>
           </w:p>
         </w:tc>
@@ -3096,9 +3224,6 @@
           </w:tcPr>
           <w:p>
             <w:r>
-              <w:rPr>
-                <w:sz w:val="18"/>
-              </w:rPr>
               <w:t>30 days</w:t>
             </w:r>
           </w:p>
@@ -3110,10 +3235,7 @@
           </w:tcPr>
           <w:p>
             <w:r>
-              <w:rPr>
-                <w:sz w:val="18"/>
-              </w:rPr>
-              <w:t>19.64%</w:t>
+              <w:t>17.80%</w:t>
             </w:r>
           </w:p>
         </w:tc>
@@ -3124,10 +3246,7 @@
           </w:tcPr>
           <w:p>
             <w:r>
-              <w:rPr>
-                <w:sz w:val="18"/>
-              </w:rPr>
-              <w:t>27.54%</w:t>
+              <w:t>26.00%</w:t>
             </w:r>
           </w:p>
         </w:tc>
@@ -3138,10 +3257,7 @@
           </w:tcPr>
           <w:p>
             <w:r>
-              <w:rPr>
-                <w:sz w:val="18"/>
-              </w:rPr>
-              <w:t>22.82%</w:t>
+              <w:t>17.97%</w:t>
             </w:r>
           </w:p>
         </w:tc>
@@ -3152,10 +3268,7 @@
           </w:tcPr>
           <w:p>
             <w:r>
-              <w:rPr>
-                <w:sz w:val="18"/>
-              </w:rPr>
-              <w:t>20.13%</w:t>
+              <w:t>18.51%</w:t>
             </w:r>
           </w:p>
         </w:tc>
@@ -3166,10 +3279,7 @@
           </w:tcPr>
           <w:p>
             <w:r>
-              <w:rPr>
-                <w:sz w:val="18"/>
-              </w:rPr>
-              <w:t>19.89%</w:t>
+              <w:t>17.31%</w:t>
             </w:r>
           </w:p>
         </w:tc>
@@ -3178,13 +3288,13 @@
     <w:p>
       <w:pPr/>
       <w:r>
-        <w:t>On this unverified candidate series, the seasonal-naive baseline was slightly lower than SARIMA at the 7- and 14-day horizons; SARIMA was slightly lower than the baseline at 30 days. These small differences are not a model-selection result because the source is unvalidated and only four rolling origins were evaluated. The published Koyambedu comparison is monthly and does not support a direct daily-horizon delta.</w:t>
+        <w:t>The common-origin mean MAPE values are shown in Table 4.3. Seasonal naive is lowest at 7, 14 and 30 days in this four-origin comparison (8.58%, 12.94% and 17.31%, respectively). SARIMA is close at each horizon, while tree-model and Prophet results vary by horizon. Four origins provide limited evidence and do not establish a robust model winner. The published Koyambedu study uses a monthly design, so its results are not directly comparable with these daily horizons.</w:t>
       </w:r>
     </w:p>
     <w:p>
       <w:pPr/>
       <w:r>
-        <w:t>The rainfall-association output covered eight commodities and found no within-sample rainfall-anomaly coefficient significant at the 5% level; this does not establish absence of weather effects. The market-arrival variable required by the proposal was not available. The retrospective procurement output produced 13 scenario cases, but source-price uncertainty and missing buyer outcomes prevent a defensible savings estimate.</w:t>
+        <w:t>The rainfall-association output includes eight commodities and 1,000 observations per commodity. The rainfall-anomaly HAC coefficient was not significant at the 5% level for any series; p-values ranged from 0.262 to 0.921. This is an exploratory result, not evidence that weather has no effect. The local file provides only two complete Northeast Monsoon seasons (2024 and 2025), no long-run climatological baseline and no market-arrival volume control. The retrospective Tomato counterfactual output contains 13 evaluation origins; absent buyer records, it does not support a savings estimate.</w:t>
       </w:r>
     </w:p>
     <w:p>
@@ -3207,7 +3317,7 @@
     </w:p>
     <w:p>
       <w:r>
-        <w:t>The project now contains a leakage-reviewed statewide modelling workflow, a common-origin four-model comparison for 7-, 14- and 30-day horizons, an exploratory rainfall-association analysis, a four-role agent pipeline and a retrospective procurement scenario. In the corrected statewide expanding-window evaluation, Random Forest had a lower mean MAPE than XGBoost (11.32% versus 13.93%) and lower error for each of the eight commodities. The separate Koyambedu comparison is not a validated wholesale result because the candidate source remains unresolved. The four-agent pipeline is implemented, but live feeds and the local language model were not exercised; the current price input is stale and all actions abstain. The procurement scenario does not establish buyer savings. These data and service limitations prevent treating the prototype as an operational procurement system.</w:t>
+        <w:t>The project contains a statewide forecasting workflow, a separate common-origin comparison of Koyambedu history-page observations, an exploratory rainfall-association analysis, a four-role AgriSight pipeline and a retrospective procurement scenario. In the saved statewide expanding-window tree-model results, XGBoost had a lower equal-commodity mean MAPE than Random Forest (6.40% versus 8.72%), winning six of eight commodity comparisons. SARIMA and Prophet were assessed under different designs. The Koyambedu prices are genuine secondary observations attributed to the Koyambedu Vegetable Merchants' Council, but the retrieved API does not establish the precise wholesale quote basis; matched-horizon scores are therefore exploratory. The offline agent brief abstained because its Tamil Nadu price input was stale. No buyer outcomes establish savings. The prototype is not an operational procurement service.</w:t>
       </w:r>
     </w:p>
     <w:p>
@@ -3255,7 +3365,7 @@
         <w:pStyle w:val="ListNumber"/>
       </w:pPr>
       <w:r>
-        <w:t>Verify Koyambedu provider, market definition, grade, quote type, date/time, unit and collection method; compare synchronized prices prospectively with a wholesale reference.</w:t>
+        <w:t>Retain the Koyambedu history-page extract and its citation as secondary data attributed to the Koyambedu Vegetable Merchants' Council. Before using it as a wholesale procurement benchmark, obtain documentation for grade, quote type, collection timing and source method, and conduct a prospective matched comparison with a defined wholesale reference.</w:t>
       </w:r>
     </w:p>
     <w:p>
@@ -3295,7 +3405,7 @@
         <w:pStyle w:val="ListBullet"/>
       </w:pPr>
       <w:r>
-        <w:t>Statewide aggregated data do not represent verified Koyambedu transactions.</w:t>
+        <w:t>The Tamil Nadu statewide aggregate does not represent a Koyambedu-specific transaction. The separate Koyambedu history-page observations are a genuine secondary series, but their unit is recorded as 1 kg and their grade and wholesale transaction basis are not independently established.</w:t>
       </w:r>
     </w:p>
     <w:p>
@@ -3372,7 +3482,7 @@
     </w:p>
     <w:p>
       <w:r>
-        <w:t>Create a verified Koyambedu panel with timestamped wholesale quotations and consistent grades; extend history; add arrivals and supply indicators where available; evaluate probabilistic forecasts; compare seasonal-naive and last-observation baselines; and measure outcomes prospectively. Later work can test whether forecast-informed purchasing lowers delivered cost while maintaining service and limiting spoilage.</w:t>
+        <w:t>For market-specific procurement use, document the Koyambedu source's price definition, grade, collection method and publication timing; compare synchronized observations prospectively with an independent wholesale reference; extend validated coverage; add market arrivals where available; and evaluate forecasts against seasonal-naive and last-observation baselines. A separate buyer pilot is required to assess whether forecast-informed purchasing changes delivered cost while maintaining service and limiting spoilage.</w:t>
       </w:r>
     </w:p>
     <w:p>
@@ -3469,6 +3579,11 @@
     <w:p>
       <w:r>
         <w:t>Fagbohun, O., Yashwanth, S., Akintola, A. S., Wurola, I., Shittu, L., Inyang, A., Odubola, O., Offia, U., Olanrewaju, S., Toluwaleke, O., Abutu, I., &amp; Akinbolaji, T. (2025). GreenIQ: A deep search platform for comprehensive carbon market analysis and automated report generation. arXiv:2503.16041. https://doi.org/10.48550/arXiv.2503.16041</w:t>
+      </w:r>
+    </w:p>
+    <w:p>
+      <w:r>
+        <w:t>Vegetable Market Price. (n.d.). Koyambedu Market Price History. Retrieved 17 October 2026, from https://vegetablemarketprice.com/market/koyambedu/history. The project attributes the published daily series to the Koyambedu Vegetable Merchants' Council.</w:t>
       </w:r>
     </w:p>
     <w:p>
@@ -4150,7 +4265,7 @@
           </w:tcPr>
           <w:p>
             <w:r>
-              <w:t>Lower MAPE than XGBoost in the corrected run</w:t>
+              <w:t>Lower MAPE than XGBoost for Beans and Onion in this run</w:t>
             </w:r>
           </w:p>
         </w:tc>
@@ -4196,7 +4311,7 @@
           </w:tcPr>
           <w:p>
             <w:r>
-              <w:t>Higher MAPE than Random Forest in the corrected run</w:t>
+              <w:t>Lower MAPE than Random Forest for six commodities in this run</w:t>
             </w:r>
           </w:p>
         </w:tc>
@@ -4328,7 +4443,7 @@
     </w:p>
     <w:p>
       <w:r>
-        <w:t>Analytical outputs reviewed for this report are stored in the local end-to-end run folder dated 15 October 2026, with source extracts, processed data, figures, model outputs, logs and dashboard records. The Streamlit process used for the run has been stopped. Re-runs should record environment and package versions, source hashes, timestamp and commands.</w:t>
+        <w:t>The latest evidence reviewed for this report is dated 17 October 2026 and includes the Koyambedu source extract and derived panel, model and objective-evaluation outputs, provenance review and AgriSight brief under outputs/. The dashboard is a local analytical interface; live source integrations were not exercised by the saved offline agent run. Re-runs should record the environment, package versions, source hashes, timestamp and commands.</w:t>
       </w:r>
     </w:p>
     <w:p>
@@ -4559,7 +4674,7 @@
     </w:p>
     <w:p>
       <w:r>
-        <w:t>The source-assessment component considers whether local price information can be interpreted and applied to a defined market. It does not substitute for provider documentation or a prospective matched comparison. Source meaning and collection practice must be established before the information is treated as wholesale ground truth.</w:t>
+        <w:t>The source-assessment component examines how published Koyambedu history values can be interpreted and applied to a defined market. The project treats the retrieved daily prices as genuine secondary observations attributed to the Koyambedu Vegetable Merchants' Council and preserves the provider values without interpolation. The history API records a 1 kg unit but does not specify all fields needed to establish product grade or wholesale transaction basis. Provider documentation and a prospective matched comparison are therefore still needed before procurement use.</w:t>
       </w:r>
     </w:p>
     <w:p>
@@ -4833,7 +4948,7 @@
     </w:p>
     <w:p>
       <w:r>
-        <w:t>Before Koyambedu values are used as a procurement reference, the provider should identify the source of every observation and state whether it is collected directly, transcribed from another source, calculated, or displayed as an indicative price. The responsible organisation, collection channel and date on which the data were first published should be documented. If the provider cannot answer these questions, the series should remain a contextual reference and not be presented as an independently verified wholesale quote.</w:t>
+        <w:t>The Koyambedu history page publishes a daily series attributed by the project to the Koyambedu Vegetable Merchants' Council. The extraction reviewed here retains its API values directly, including 51 uninterrupted Tomato observations from 3 July to 22 August 2023. This establishes the presence of a secondary historical series; it does not by itself document how each quotation was collected or whether it represents an audited wholesale transaction. Record provider documentation, collection channel, quote definition, grade and publication timing wherever available, and preserve this limitation in applications of the data.</w:t>
       </w:r>
     </w:p>
     <w:p>
@@ -5116,7 +5231,7 @@
     </w:p>
     <w:p>
       <w:r>
-        <w:t>Phase three is Koyambedu verification. Obtain provider documentation, create a matched prospective comparison, and record grade, market, time and quote type. Set an acceptance criterion with the guide before analysis. The outcome may be acceptance, conditional use or rejection for wholesale decisions; all three are valid evidence-based conclusions.</w:t>
+        <w:t>Phase three is Koyambedu measurement validation. The daily history-page series and its source attribution are retained as secondary evidence. Obtain provider documentation for grade, quote type and collection method, compare synchronized observations with an independent wholesale reference, and agree an acceptance criterion with the guide before recommending procurement use. Conditional use or rejection for that purpose are both valid evidence-based outcomes.</w:t>
       </w:r>
     </w:p>
     <w:p>
@@ -9006,7 +9121,7 @@
           </w:tcPr>
           <w:p>
             <w:r>
-              <w:t>Code implemented; market evidence unresolved</w:t>
+              <w:t>Exploratory matched-horizon evaluation complete; procurement-price equivalence remains open</w:t>
             </w:r>
           </w:p>
         </w:tc>
@@ -9017,7 +9132,7 @@
           </w:tcPr>
           <w:p>
             <w:r>
-              <w:t>Section 4.8 reports a shared-origin comparison across four models and a seasonal-naive baseline at all three horizons. Four origins are used for each commodity/horizon.</w:t>
+              <w:t>Section 4.8 reports common-origin MAPE for five methods at 7-, 14- and 30-day horizons across eight mapped Koyambedu history-page series. Seasonal naive has the lowest pooled mean at each horizon in this four-origin run.</w:t>
             </w:r>
           </w:p>
         </w:tc>
@@ -9028,7 +9143,7 @@
           </w:tcPr>
           <w:p>
             <w:r>
-              <w:t>Script 14 writes row-level predictions and metrics. The Koyambedu price series remains unverified wholesale data; the published benchmark is monthly and not numerically comparable. Reconcile the source and add a compatible reference benchmark before claiming objective completion.</w:t>
+              <w:t>The observations are genuine secondary data attributed to the Koyambedu Vegetable Merchants Council. The API records a 1 kg unit but does not define grade or quote basis. Results are exploratory; the published Koyambedu study is monthly and not numerically comparable.</w:t>
             </w:r>
           </w:p>
         </w:tc>
@@ -9058,7 +9173,7 @@
           </w:tcPr>
           <w:p>
             <w:r>
-              <w:t>Analysis implemented; finding inconclusive</w:t>
+              <w:t>Exploratory association analysis complete; proposed significance claim not established</w:t>
             </w:r>
           </w:p>
         </w:tc>
@@ -9069,7 +9184,7 @@
           </w:tcPr>
           <w:p>
             <w:r>
-              <w:t>Script 14 computes within-month rainfall anomalies and HAC tests for seven-day returns, controlling for prior price momentum. No rainfall coefficient met the 5% threshold in this exploratory sample.</w:t>
+              <w:t>Eight commodity regressions found no rainfall-anomaly coefficient significant at 5%; p-values ranged from 0.262 to 0.921.</w:t>
             </w:r>
           </w:p>
         </w:tc>
@@ -9080,7 +9195,7 @@
           </w:tcPr>
           <w:p>
             <w:r>
-              <w:t>Arrival volume is absent; weather history is short and not a long-run monsoon normal; the Koyambedu series is unverified. SHAP ranks model contributions but does not establish statistical significance. Add verified arrival volumes and longer weather history.</w:t>
+              <w:t>Only two complete Northeast Monsoon seasons are available; anomaly uses the short local weather record, and market arrivals are absent. SHAP attribution is not a significance test.</w:t>
             </w:r>
           </w:p>
         </w:tc>
@@ -9121,7 +9236,7 @@
           </w:tcPr>
           <w:p>
             <w:r>
-              <w:t>Script 15 provides Data Collector, Price Forecaster, News Reader and Report Writer roles. The offline run produced eight recursive forecasts and abstained because local prices were stale.</w:t>
+              <w:t>Script 15 implements the four roles and optional external feeds. The saved offline brief used stale Tamil Nadu aggregate prices and abstained on all eight actions.</w:t>
             </w:r>
           </w:p>
         </w:tc>
@@ -9132,7 +9247,7 @@
           </w:tcPr>
           <w:p>
             <w:r>
-              <w:t>Optional Open-Meteo forecast, PIB RSS and local Ollama connections are implemented but were not exercised. Supply current validated price inputs, configure the local model, and validate the live integrations before operational completion.</w:t>
+              <w:t>Live Open-Meteo, PIB RSS and local Ollama integrations were not exercised in the saved run. Refresh and validate inputs and services before claiming operational readiness.</w:t>
             </w:r>
           </w:p>
         </w:tc>
@@ -9156,7 +9271,7 @@
           </w:tcPr>
           <w:p>
             <w:r>
-              <w:t>Scenario implemented; economic objective unverified</w:t>
+              <w:t>Counterfactual scenario complete; realized savings not established</w:t>
             </w:r>
           </w:p>
         </w:tc>
@@ -9167,7 +9282,7 @@
           </w:tcPr>
           <w:p>
             <w:r>
-              <w:t>Script 14 generated a 14-day XGBoost counterfactual at 13 retrospective Tomato origins using a normalized source-unit scenario.</w:t>
+              <w:t>Script 14 tested a 14-day rule-based counterfactual at 13 retrospective Tomato origins using the Koyambedu secondary history-page series.</w:t>
             </w:r>
           </w:p>
         </w:tc>
@@ -9178,7 +9293,7 @@
           </w:tcPr>
           <w:p>
             <w:r>
-              <w:t>The source price basis is unresolved and buyer transaction, service, spoilage and inventory outcomes are missing. Do not interpret scenario differences as procurement savings. Reconcile prices and measure buyer outcomes against a predeclared baseline.</w:t>
+              <w:t>The API observations are attributed to the Koyambedu Vegetable Merchants Council, but grade/transaction basis and buyer records are absent. Scenario deltas are not savings; validate source definitions and collect real purchase outcomes.</w:t>
             </w:r>
           </w:p>
         </w:tc>

</xml_diff>